<commit_message>
Enhance CV generation script for Tyra Rebecca Nalukwago. Updated the script to improve visual presentation by refining color palette and font registration for PDF output. Adjusted layout and spacing in the CV document for better readability. Updated tagline formatting and enhanced section headings for a more polished look in both DOCX and PDF formats.
</commit_message>
<xml_diff>
--- a/tyra_cv/TYRA_REBECCA_NALUKWAGO_CV.docx
+++ b/tyra_cv/TYRA_REBECCA_NALUKWAGO_CV.docx
@@ -2,1485 +2,2127 @@
 <file path=word/document.xml><?xml version="1.0" encoding="utf-8"?>
 <w:document xmlns:wpc="http://schemas.microsoft.com/office/word/2010/wordprocessingCanvas" xmlns:mo="http://schemas.microsoft.com/office/mac/office/2008/main" xmlns:mc="http://schemas.openxmlformats.org/markup-compatibility/2006" xmlns:mv="urn:schemas-microsoft-com:mac:vml" xmlns:o="urn:schemas-microsoft-com:office:office" xmlns:r="http://schemas.openxmlformats.org/officeDocument/2006/relationships" xmlns:m="http://schemas.openxmlformats.org/officeDocument/2006/math" xmlns:v="urn:schemas-microsoft-com:vml" xmlns:wp14="http://schemas.microsoft.com/office/word/2010/wordprocessingDrawing" xmlns:wp="http://schemas.openxmlformats.org/drawingml/2006/wordprocessingDrawing" xmlns:w10="urn:schemas-microsoft-com:office:word" xmlns:w="http://schemas.openxmlformats.org/wordprocessingml/2006/main" xmlns:w14="http://schemas.microsoft.com/office/word/2010/wordml" xmlns:wpg="http://schemas.microsoft.com/office/word/2010/wordprocessingGroup" xmlns:wpi="http://schemas.microsoft.com/office/word/2010/wordprocessingInk" xmlns:wne="http://schemas.microsoft.com/office/word/2006/wordml" xmlns:wps="http://schemas.microsoft.com/office/word/2010/wordprocessingShape" mc:Ignorable="w14 wp14">
   <w:body>
-    <w:p>
-      <w:pPr>
-        <w:spacing w:before="0" w:after="40" w:line="240" w:lineRule="auto"/>
-        <w:jc w:val="center"/>
-      </w:pPr>
-      <w:r>
-        <w:rPr>
-          <w:rFonts w:ascii="Calibri" w:hAnsi="Calibri" w:eastAsia="Calibri"/>
-          <w:b/>
-          <w:i w:val="0"/>
-          <w:color w:val="1B3A4B"/>
-          <w:sz w:val="40"/>
-        </w:rPr>
-        <w:t>TYRA REBECCA NALUKWAGO</w:t>
-      </w:r>
-    </w:p>
-    <w:p>
-      <w:pPr>
-        <w:spacing w:before="0" w:after="40" w:line="240" w:lineRule="auto"/>
-        <w:jc w:val="center"/>
-      </w:pPr>
-      <w:r>
-        <w:rPr>
-          <w:rFonts w:ascii="Calibri" w:hAnsi="Calibri" w:eastAsia="Calibri"/>
-          <w:b w:val="0"/>
-          <w:i w:val="0"/>
-          <w:color w:val="2C5F6E"/>
-          <w:sz w:val="20"/>
-        </w:rPr>
-        <w:t>Senior Valuation Surveyor  |  Land Economist  |  Property &amp; Resettlement Specialist</w:t>
-      </w:r>
-    </w:p>
-    <w:p>
-      <w:pPr>
-        <w:spacing w:before="40" w:after="160" w:line="240" w:lineRule="auto"/>
-        <w:pBdr>
-          <w:bottom w:val="single" w:sz="18" w:space="4" w:color="1B3A4B"/>
-        </w:pBdr>
-      </w:pPr>
-    </w:p>
-    <w:p>
-      <w:pPr>
-        <w:spacing w:before="240" w:after="80" w:line="240" w:lineRule="auto"/>
-        <w:pBdr>
-          <w:bottom w:val="single" w:sz="12" w:space="4" w:color="2C5F6E"/>
-        </w:pBdr>
-      </w:pPr>
-      <w:r>
-        <w:rPr>
-          <w:rFonts w:ascii="Calibri" w:hAnsi="Calibri" w:eastAsia="Calibri"/>
-          <w:b/>
-          <w:i w:val="0"/>
-          <w:color w:val="1B3A4B"/>
-          <w:sz w:val="22"/>
-        </w:rPr>
-        <w:t>PROFESSIONAL PROFILE</w:t>
-      </w:r>
-    </w:p>
-    <w:p>
-      <w:pPr>
-        <w:spacing w:before="40" w:after="80" w:line="264" w:lineRule="auto"/>
-        <w:jc w:val="both"/>
-      </w:pPr>
-      <w:r>
-        <w:rPr>
-          <w:rFonts w:ascii="Calibri" w:hAnsi="Calibri" w:eastAsia="Calibri"/>
-          <w:b w:val="0"/>
-          <w:i w:val="0"/>
-          <w:color w:val="4A5568"/>
-          <w:sz w:val="19"/>
-        </w:rPr>
-        <w:t>Accomplished Land Economist and Graduate Valuation Surveyor with over five years of professional experience in property valuation, land acquisition, compensation assessment, Resettlement Action Plans (RAPs), and property management. Demonstrated expertise in supporting large-scale infrastructure, energy, mining, water, and transport projects across Uganda for government agencies, financial institutions, and private-sector clients.</w:t>
-      </w:r>
-    </w:p>
-    <w:p>
-      <w:pPr>
-        <w:spacing w:before="40" w:after="80" w:line="264" w:lineRule="auto"/>
-        <w:jc w:val="both"/>
-      </w:pPr>
-      <w:r>
-        <w:rPr>
-          <w:rFonts w:ascii="Calibri" w:hAnsi="Calibri" w:eastAsia="Calibri"/>
-          <w:b w:val="0"/>
-          <w:i w:val="0"/>
-          <w:color w:val="4A5568"/>
-          <w:sz w:val="19"/>
-        </w:rPr>
-        <w:t>Highly experienced in valuation methodologies, stakeholder engagement, community sensitisation, mortgage valuations, market analysis, and preparation of comprehensive valuation reports. A Graduate Member of the Institute of Surveyors of Uganda (ISU), committed to delivering professional, ethical, and data-driven valuation services that support sustainable development and investment.</w:t>
-      </w:r>
-    </w:p>
-    <w:p>
-      <w:pPr>
-        <w:spacing w:before="240" w:after="80" w:line="240" w:lineRule="auto"/>
-        <w:pBdr>
-          <w:bottom w:val="single" w:sz="12" w:space="4" w:color="2C5F6E"/>
-        </w:pBdr>
-      </w:pPr>
-      <w:r>
-        <w:rPr>
-          <w:rFonts w:ascii="Calibri" w:hAnsi="Calibri" w:eastAsia="Calibri"/>
-          <w:b/>
-          <w:i w:val="0"/>
-          <w:color w:val="1B3A4B"/>
-          <w:sz w:val="22"/>
-        </w:rPr>
-        <w:t>CAREER HIGHLIGHTS</w:t>
-      </w:r>
-    </w:p>
     <w:tbl>
       <w:tblPr>
         <w:tblW w:type="auto" w:w="0"/>
-        <w:tblLayout w:type="autofit"/>
+        <w:jc w:val="center"/>
         <w:tblLook w:firstColumn="1" w:firstRow="1" w:lastColumn="0" w:lastRow="0" w:noHBand="0" w:noVBand="1" w:val="04A0"/>
+        <w:tblBorders>
+          <w:top w:val="nil" w:sz="0" w:space="0" w:color="auto"/>
+          <w:left w:val="nil" w:sz="0" w:space="0" w:color="auto"/>
+          <w:bottom w:val="nil" w:sz="0" w:space="0" w:color="auto"/>
+          <w:right w:val="nil" w:sz="0" w:space="0" w:color="auto"/>
+          <w:insideH w:val="nil" w:sz="0" w:space="0" w:color="auto"/>
+          <w:insideV w:val="nil" w:sz="0" w:space="0" w:color="auto"/>
+        </w:tblBorders>
       </w:tblPr>
       <w:tblGrid>
-        <w:gridCol w:w="5046"/>
-        <w:gridCol w:w="5046"/>
+        <w:gridCol w:w="9026"/>
       </w:tblGrid>
       <w:tr>
         <w:tc>
           <w:tcPr>
-            <w:tcW w:type="dxa" w:w="5046"/>
+            <w:tcW w:type="dxa" w:w="9026"/>
+            <w:shd w:fill="0F3D4C" w:val="clear"/>
             <w:tcMar>
-              <w:top w:w="20" w:type="dxa"/>
-              <w:left w:w="40" w:type="dxa"/>
-              <w:bottom w:w="20" w:type="dxa"/>
-              <w:right w:w="80" w:type="dxa"/>
+              <w:top w:w="160" w:type="dxa"/>
+              <w:left w:w="200" w:type="dxa"/>
+              <w:bottom w:w="140" w:type="dxa"/>
+              <w:right w:w="200" w:type="dxa"/>
             </w:tcMar>
           </w:tcPr>
           <w:p>
             <w:pPr>
-              <w:spacing w:before="0" w:after="20" w:line="252" w:lineRule="auto"/>
+              <w:spacing w:before="0" w:after="80" w:line="240" w:lineRule="auto"/>
+              <w:jc w:val="center"/>
             </w:pPr>
-            <w:r/>
+            <w:r>
+              <w:rPr>
+                <w:rFonts w:ascii="Georgia" w:hAnsi="Georgia" w:eastAsia="Georgia"/>
+                <w:b/>
+                <w:i w:val="0"/>
+                <w:color w:val="FFFFFF"/>
+                <w:sz w:val="52"/>
+              </w:rPr>
+              <w:t>TYRA REBECCA NALUKWAGO</w:t>
+            </w:r>
+          </w:p>
+          <w:p>
+            <w:pPr>
+              <w:spacing w:before="0" w:after="40" w:line="240" w:lineRule="auto"/>
+              <w:jc w:val="center"/>
+            </w:pPr>
             <w:r>
               <w:rPr>
                 <w:rFonts w:ascii="Calibri" w:hAnsi="Calibri" w:eastAsia="Calibri"/>
                 <w:b w:val="0"/>
                 <w:i w:val="0"/>
-                <w:color w:val="4A5568"/>
-                <w:sz w:val="18"/>
+                <w:color w:val="D4E4EA"/>
+                <w:sz w:val="23"/>
               </w:rPr>
-              <w:t>•  5+ years of professional valuation and land economics experience</w:t>
+              <w:t>Senior Valuation Surveyor  ·  Land Economist  ·  Property &amp; Resettlement Specialist</w:t>
             </w:r>
           </w:p>
         </w:tc>
+      </w:tr>
+    </w:tbl>
+    <w:tbl>
+      <w:tblPr>
+        <w:tblW w:type="auto" w:w="0"/>
+        <w:tblLook w:firstColumn="1" w:firstRow="1" w:lastColumn="0" w:lastRow="0" w:noHBand="0" w:noVBand="1" w:val="04A0"/>
+        <w:tblBorders>
+          <w:top w:val="nil" w:sz="0" w:space="0" w:color="auto"/>
+          <w:left w:val="nil" w:sz="0" w:space="0" w:color="auto"/>
+          <w:bottom w:val="nil" w:sz="0" w:space="0" w:color="auto"/>
+          <w:right w:val="nil" w:sz="0" w:space="0" w:color="auto"/>
+          <w:insideH w:val="nil" w:sz="0" w:space="0" w:color="auto"/>
+          <w:insideV w:val="nil" w:sz="0" w:space="0" w:color="auto"/>
+        </w:tblBorders>
+      </w:tblPr>
+      <w:tblGrid>
+        <w:gridCol w:w="9026"/>
+      </w:tblGrid>
+      <w:tr>
         <w:tc>
           <w:tcPr>
-            <w:tcW w:type="dxa" w:w="5046"/>
+            <w:tcW w:type="dxa" w:w="9026"/>
+            <w:shd w:fill="C4A35A" w:val="clear"/>
             <w:tcMar>
-              <w:top w:w="20" w:type="dxa"/>
-              <w:left w:w="40" w:type="dxa"/>
-              <w:bottom w:w="20" w:type="dxa"/>
-              <w:right w:w="80" w:type="dxa"/>
+              <w:top w:w="0" w:type="dxa"/>
+              <w:left w:w="0" w:type="dxa"/>
+              <w:bottom w:w="0" w:type="dxa"/>
+              <w:right w:w="0" w:type="dxa"/>
             </w:tcMar>
           </w:tcPr>
           <w:p>
             <w:pPr>
-              <w:spacing w:before="0" w:after="20" w:line="252" w:lineRule="auto"/>
+              <w:spacing w:before="0" w:after="0" w:line="120" w:lineRule="auto"/>
             </w:pPr>
-            <w:r/>
             <w:r>
               <w:rPr>
                 <w:rFonts w:ascii="Calibri" w:hAnsi="Calibri" w:eastAsia="Calibri"/>
                 <w:b w:val="0"/>
                 <w:i w:val="0"/>
-                <w:color w:val="4A5568"/>
-                <w:sz w:val="18"/>
+                <w:sz w:val="6"/>
               </w:rPr>
-              <w:t>•  Worked on major national infrastructure, energy and mining projects</w:t>
+              <w:t xml:space="preserve"> </w:t>
             </w:r>
           </w:p>
         </w:tc>
       </w:tr>
+    </w:tbl>
+    <w:tbl>
+      <w:tblPr>
+        <w:tblW w:type="auto" w:w="0"/>
+        <w:tblLook w:firstColumn="1" w:firstRow="1" w:lastColumn="0" w:lastRow="0" w:noHBand="0" w:noVBand="1" w:val="04A0"/>
+        <w:tblBorders>
+          <w:top w:val="nil" w:sz="0" w:space="0" w:color="auto"/>
+          <w:left w:val="nil" w:sz="0" w:space="0" w:color="auto"/>
+          <w:bottom w:val="nil" w:sz="0" w:space="0" w:color="auto"/>
+          <w:right w:val="nil" w:sz="0" w:space="0" w:color="auto"/>
+          <w:insideH w:val="nil" w:sz="0" w:space="0" w:color="auto"/>
+          <w:insideV w:val="nil" w:sz="0" w:space="0" w:color="auto"/>
+        </w:tblBorders>
+      </w:tblPr>
+      <w:tblGrid>
+        <w:gridCol w:w="9026"/>
+      </w:tblGrid>
       <w:tr>
         <w:tc>
           <w:tcPr>
-            <w:tcW w:type="dxa" w:w="5046"/>
+            <w:tcW w:type="dxa" w:w="9026"/>
             <w:tcMar>
-              <w:top w:w="20" w:type="dxa"/>
-              <w:left w:w="40" w:type="dxa"/>
-              <w:bottom w:w="20" w:type="dxa"/>
-              <w:right w:w="80" w:type="dxa"/>
+              <w:top w:w="80" w:type="dxa"/>
+              <w:left w:w="200" w:type="dxa"/>
+              <w:bottom w:w="40" w:type="dxa"/>
+              <w:right w:w="200" w:type="dxa"/>
             </w:tcMar>
           </w:tcPr>
+          <w:p/>
           <w:p>
             <w:pPr>
-              <w:spacing w:before="0" w:after="20" w:line="252" w:lineRule="auto"/>
+              <w:spacing w:before="240" w:after="60" w:line="269" w:lineRule="auto"/>
+              <w:jc w:val="left"/>
+              <w:pBdr>
+                <w:bottom w:val="single" w:sz="12" w:space="5" w:color="1A5A6E"/>
+              </w:pBdr>
             </w:pPr>
-            <w:r/>
+            <w:r>
+              <w:rPr>
+                <w:rFonts w:ascii="Calibri" w:hAnsi="Calibri" w:eastAsia="Calibri"/>
+                <w:b/>
+                <w:i w:val="0"/>
+                <w:color w:val="0F3D4C"/>
+                <w:sz w:val="26"/>
+              </w:rPr>
+              <w:t>PROFESSIONAL PROFILE</w:t>
+            </w:r>
+          </w:p>
+          <w:p>
+            <w:pPr>
+              <w:spacing w:before="40" w:after="80" w:line="269" w:lineRule="auto"/>
+              <w:jc w:val="both"/>
+            </w:pPr>
             <w:r>
               <w:rPr>
                 <w:rFonts w:ascii="Calibri" w:hAnsi="Calibri" w:eastAsia="Calibri"/>
                 <w:b w:val="0"/>
                 <w:i w:val="0"/>
-                <w:color w:val="4A5568"/>
-                <w:sz w:val="18"/>
+                <w:color w:val="2D3748"/>
+                <w:sz w:val="22"/>
               </w:rPr>
-              <w:t>•  Graduate Member, Institute of Surveyors of Uganda (ISU)</w:t>
+              <w:t>Accomplished Land Economist and Graduate Valuation Surveyor with over five years of professional experience in property valuation, land acquisition, compensation assessment, Resettlement Action Plans (RAPs), and property management. Demonstrated expertise in supporting large-scale infrastructure, energy, mining, water, and transport projects across Uganda for government agencies, financial institutions, and private-sector clients.</w:t>
             </w:r>
           </w:p>
-        </w:tc>
-        <w:tc>
-          <w:tcPr>
-            <w:tcW w:type="dxa" w:w="5046"/>
-            <w:tcMar>
-              <w:top w:w="20" w:type="dxa"/>
-              <w:left w:w="40" w:type="dxa"/>
-              <w:bottom w:w="20" w:type="dxa"/>
-              <w:right w:w="80" w:type="dxa"/>
-            </w:tcMar>
-          </w:tcPr>
           <w:p>
             <w:pPr>
-              <w:spacing w:before="0" w:after="20" w:line="252" w:lineRule="auto"/>
+              <w:spacing w:before="40" w:after="80" w:line="269" w:lineRule="auto"/>
+              <w:jc w:val="both"/>
             </w:pPr>
-            <w:r/>
             <w:r>
               <w:rPr>
                 <w:rFonts w:ascii="Calibri" w:hAnsi="Calibri" w:eastAsia="Calibri"/>
                 <w:b w:val="0"/>
                 <w:i w:val="0"/>
-                <w:color w:val="4A5568"/>
-                <w:sz w:val="18"/>
+                <w:color w:val="2D3748"/>
+                <w:sz w:val="22"/>
               </w:rPr>
-              <w:t>•  Valuation assignments for leading commercial banks in Uganda</w:t>
+              <w:t>Highly experienced in valuation methodologies, stakeholder engagement, community sensitisation, mortgage valuations, market analysis, and preparation of comprehensive valuation reports. A Graduate Member of the Institute of Surveyors of Uganda (ISU), committed to delivering professional, ethical, and data-driven valuation services that support sustainable development and investment.</w:t>
             </w:r>
           </w:p>
-        </w:tc>
-      </w:tr>
-      <w:tr>
-        <w:tc>
-          <w:tcPr>
-            <w:tcW w:type="dxa" w:w="5046"/>
-            <w:tcMar>
-              <w:top w:w="20" w:type="dxa"/>
-              <w:left w:w="40" w:type="dxa"/>
-              <w:bottom w:w="20" w:type="dxa"/>
-              <w:right w:w="80" w:type="dxa"/>
-            </w:tcMar>
-          </w:tcPr>
           <w:p>
             <w:pPr>
-              <w:spacing w:before="0" w:after="20" w:line="252" w:lineRule="auto"/>
+              <w:spacing w:before="240" w:after="60" w:line="269" w:lineRule="auto"/>
+              <w:jc w:val="left"/>
+              <w:pBdr>
+                <w:bottom w:val="single" w:sz="12" w:space="5" w:color="1A5A6E"/>
+              </w:pBdr>
             </w:pPr>
-            <w:r/>
+            <w:r>
+              <w:rPr>
+                <w:rFonts w:ascii="Calibri" w:hAnsi="Calibri" w:eastAsia="Calibri"/>
+                <w:b/>
+                <w:i w:val="0"/>
+                <w:color w:val="0F3D4C"/>
+                <w:sz w:val="26"/>
+              </w:rPr>
+              <w:t>CAREER HIGHLIGHTS</w:t>
+            </w:r>
+          </w:p>
+          <w:tbl>
+            <w:tblPr>
+              <w:tblW w:type="auto" w:w="0"/>
+              <w:tblLook w:firstColumn="1" w:firstRow="1" w:lastColumn="0" w:lastRow="0" w:noHBand="0" w:noVBand="1" w:val="04A0"/>
+              <w:tblBorders>
+                <w:top w:val="nil" w:sz="0" w:space="0" w:color="auto"/>
+                <w:left w:val="nil" w:sz="0" w:space="0" w:color="auto"/>
+                <w:bottom w:val="nil" w:sz="0" w:space="0" w:color="auto"/>
+                <w:right w:val="nil" w:sz="0" w:space="0" w:color="auto"/>
+                <w:insideH w:val="nil" w:sz="0" w:space="0" w:color="auto"/>
+                <w:insideV w:val="nil" w:sz="0" w:space="0" w:color="auto"/>
+              </w:tblBorders>
+            </w:tblPr>
+            <w:tblGrid>
+              <w:gridCol w:w="9026"/>
+            </w:tblGrid>
+            <w:tr>
+              <w:tc>
+                <w:tcPr>
+                  <w:tcW w:type="dxa" w:w="9026"/>
+                  <w:shd w:fill="E8F1F4" w:val="clear"/>
+                  <w:tcMar>
+                    <w:top w:w="60" w:type="dxa"/>
+                    <w:left w:w="100" w:type="dxa"/>
+                    <w:bottom w:w="50" w:type="dxa"/>
+                    <w:right w:w="100" w:type="dxa"/>
+                  </w:tcMar>
+                </w:tcPr>
+                <w:p/>
+                <w:tbl>
+                  <w:tblPr>
+                    <w:tblW w:type="auto" w:w="0"/>
+                    <w:tblLook w:firstColumn="1" w:firstRow="1" w:lastColumn="0" w:lastRow="0" w:noHBand="0" w:noVBand="1" w:val="04A0"/>
+                    <w:tblBorders>
+                      <w:top w:val="nil" w:sz="0" w:space="0" w:color="auto"/>
+                      <w:left w:val="nil" w:sz="0" w:space="0" w:color="auto"/>
+                      <w:bottom w:val="nil" w:sz="0" w:space="0" w:color="auto"/>
+                      <w:right w:val="nil" w:sz="0" w:space="0" w:color="auto"/>
+                      <w:insideH w:val="nil" w:sz="0" w:space="0" w:color="auto"/>
+                      <w:insideV w:val="nil" w:sz="0" w:space="0" w:color="auto"/>
+                    </w:tblBorders>
+                  </w:tblPr>
+                  <w:tblGrid>
+                    <w:gridCol w:w="4513"/>
+                    <w:gridCol w:w="4513"/>
+                  </w:tblGrid>
+                  <w:tr>
+                    <w:tc>
+                      <w:tcPr>
+                        <w:tcW w:type="dxa" w:w="4513"/>
+                        <w:tcMar>
+                          <w:top w:w="20" w:type="dxa"/>
+                          <w:left w:w="40" w:type="dxa"/>
+                          <w:bottom w:w="20" w:type="dxa"/>
+                          <w:right w:w="60" w:type="dxa"/>
+                        </w:tcMar>
+                      </w:tcPr>
+                      <w:p>
+                        <w:pPr>
+                          <w:spacing w:before="0" w:after="0" w:line="276" w:lineRule="auto"/>
+                        </w:pPr>
+                        <w:r/>
+                        <w:r>
+                          <w:rPr>
+                            <w:rFonts w:ascii="Calibri" w:hAnsi="Calibri" w:eastAsia="Calibri"/>
+                            <w:b w:val="0"/>
+                            <w:i w:val="0"/>
+                            <w:color w:val="1A5A6E"/>
+                            <w:sz w:val="21"/>
+                          </w:rPr>
+                          <w:t>•  5+ years of professional valuation and land economics experience</w:t>
+                        </w:r>
+                      </w:p>
+                    </w:tc>
+                    <w:tc>
+                      <w:tcPr>
+                        <w:tcW w:type="dxa" w:w="4513"/>
+                        <w:tcMar>
+                          <w:top w:w="20" w:type="dxa"/>
+                          <w:left w:w="40" w:type="dxa"/>
+                          <w:bottom w:w="20" w:type="dxa"/>
+                          <w:right w:w="60" w:type="dxa"/>
+                        </w:tcMar>
+                      </w:tcPr>
+                      <w:p>
+                        <w:pPr>
+                          <w:spacing w:before="0" w:after="0" w:line="276" w:lineRule="auto"/>
+                        </w:pPr>
+                        <w:r/>
+                        <w:r>
+                          <w:rPr>
+                            <w:rFonts w:ascii="Calibri" w:hAnsi="Calibri" w:eastAsia="Calibri"/>
+                            <w:b w:val="0"/>
+                            <w:i w:val="0"/>
+                            <w:color w:val="1A5A6E"/>
+                            <w:sz w:val="21"/>
+                          </w:rPr>
+                          <w:t>•  Worked on major national infrastructure, energy and mining projects</w:t>
+                        </w:r>
+                      </w:p>
+                    </w:tc>
+                  </w:tr>
+                  <w:tr>
+                    <w:tc>
+                      <w:tcPr>
+                        <w:tcW w:type="dxa" w:w="4513"/>
+                        <w:tcMar>
+                          <w:top w:w="20" w:type="dxa"/>
+                          <w:left w:w="40" w:type="dxa"/>
+                          <w:bottom w:w="20" w:type="dxa"/>
+                          <w:right w:w="60" w:type="dxa"/>
+                        </w:tcMar>
+                      </w:tcPr>
+                      <w:p>
+                        <w:pPr>
+                          <w:spacing w:before="0" w:after="0" w:line="276" w:lineRule="auto"/>
+                        </w:pPr>
+                        <w:r/>
+                        <w:r>
+                          <w:rPr>
+                            <w:rFonts w:ascii="Calibri" w:hAnsi="Calibri" w:eastAsia="Calibri"/>
+                            <w:b w:val="0"/>
+                            <w:i w:val="0"/>
+                            <w:color w:val="1A5A6E"/>
+                            <w:sz w:val="21"/>
+                          </w:rPr>
+                          <w:t>•  Graduate Member, Institute of Surveyors of Uganda (ISU)</w:t>
+                        </w:r>
+                      </w:p>
+                    </w:tc>
+                    <w:tc>
+                      <w:tcPr>
+                        <w:tcW w:type="dxa" w:w="4513"/>
+                        <w:tcMar>
+                          <w:top w:w="20" w:type="dxa"/>
+                          <w:left w:w="40" w:type="dxa"/>
+                          <w:bottom w:w="20" w:type="dxa"/>
+                          <w:right w:w="60" w:type="dxa"/>
+                        </w:tcMar>
+                      </w:tcPr>
+                      <w:p>
+                        <w:pPr>
+                          <w:spacing w:before="0" w:after="0" w:line="276" w:lineRule="auto"/>
+                        </w:pPr>
+                        <w:r/>
+                        <w:r>
+                          <w:rPr>
+                            <w:rFonts w:ascii="Calibri" w:hAnsi="Calibri" w:eastAsia="Calibri"/>
+                            <w:b w:val="0"/>
+                            <w:i w:val="0"/>
+                            <w:color w:val="1A5A6E"/>
+                            <w:sz w:val="21"/>
+                          </w:rPr>
+                          <w:t>•  Valuation assignments for leading commercial banks in Uganda</w:t>
+                        </w:r>
+                      </w:p>
+                    </w:tc>
+                  </w:tr>
+                  <w:tr>
+                    <w:tc>
+                      <w:tcPr>
+                        <w:tcW w:type="dxa" w:w="4513"/>
+                        <w:tcMar>
+                          <w:top w:w="20" w:type="dxa"/>
+                          <w:left w:w="40" w:type="dxa"/>
+                          <w:bottom w:w="20" w:type="dxa"/>
+                          <w:right w:w="60" w:type="dxa"/>
+                        </w:tcMar>
+                      </w:tcPr>
+                      <w:p>
+                        <w:pPr>
+                          <w:spacing w:before="0" w:after="0" w:line="276" w:lineRule="auto"/>
+                        </w:pPr>
+                        <w:r/>
+                        <w:r>
+                          <w:rPr>
+                            <w:rFonts w:ascii="Calibri" w:hAnsi="Calibri" w:eastAsia="Calibri"/>
+                            <w:b w:val="0"/>
+                            <w:i w:val="0"/>
+                            <w:color w:val="1A5A6E"/>
+                            <w:sz w:val="21"/>
+                          </w:rPr>
+                          <w:t>•  Extensive experience in Resettlement Action Plans (RAPs)</w:t>
+                        </w:r>
+                      </w:p>
+                    </w:tc>
+                    <w:tc>
+                      <w:tcPr>
+                        <w:tcW w:type="dxa" w:w="4513"/>
+                        <w:tcMar>
+                          <w:top w:w="20" w:type="dxa"/>
+                          <w:left w:w="40" w:type="dxa"/>
+                          <w:bottom w:w="20" w:type="dxa"/>
+                          <w:right w:w="60" w:type="dxa"/>
+                        </w:tcMar>
+                      </w:tcPr>
+                      <w:p>
+                        <w:pPr>
+                          <w:spacing w:before="0" w:after="0" w:line="276" w:lineRule="auto"/>
+                        </w:pPr>
+                        <w:r/>
+                        <w:r>
+                          <w:rPr>
+                            <w:rFonts w:ascii="Calibri" w:hAnsi="Calibri" w:eastAsia="Calibri"/>
+                            <w:b w:val="0"/>
+                            <w:i w:val="0"/>
+                            <w:color w:val="1A5A6E"/>
+                            <w:sz w:val="21"/>
+                          </w:rPr>
+                          <w:t>•  Strong stakeholder engagement and community mobilisation skills</w:t>
+                        </w:r>
+                      </w:p>
+                    </w:tc>
+                  </w:tr>
+                  <w:tr>
+                    <w:tc>
+                      <w:tcPr>
+                        <w:tcW w:type="dxa" w:w="4513"/>
+                        <w:tcMar>
+                          <w:top w:w="20" w:type="dxa"/>
+                          <w:left w:w="40" w:type="dxa"/>
+                          <w:bottom w:w="20" w:type="dxa"/>
+                          <w:right w:w="60" w:type="dxa"/>
+                        </w:tcMar>
+                      </w:tcPr>
+                      <w:p>
+                        <w:pPr>
+                          <w:spacing w:before="0" w:after="0" w:line="276" w:lineRule="auto"/>
+                        </w:pPr>
+                        <w:r/>
+                        <w:r>
+                          <w:rPr>
+                            <w:rFonts w:ascii="Calibri" w:hAnsi="Calibri" w:eastAsia="Calibri"/>
+                            <w:b w:val="0"/>
+                            <w:i w:val="0"/>
+                            <w:color w:val="1A5A6E"/>
+                            <w:sz w:val="21"/>
+                          </w:rPr>
+                          <w:t>•  Property valuation for mortgage, compensation and acquisition</w:t>
+                        </w:r>
+                      </w:p>
+                    </w:tc>
+                    <w:tc>
+                      <w:tcPr>
+                        <w:tcW w:type="dxa" w:w="4513"/>
+                        <w:tcMar>
+                          <w:top w:w="20" w:type="dxa"/>
+                          <w:left w:w="40" w:type="dxa"/>
+                          <w:bottom w:w="20" w:type="dxa"/>
+                          <w:right w:w="60" w:type="dxa"/>
+                        </w:tcMar>
+                      </w:tcPr>
+                      <w:p>
+                        <w:pPr>
+                          <w:spacing w:before="0" w:after="0" w:line="276" w:lineRule="auto"/>
+                        </w:pPr>
+                        <w:r/>
+                      </w:p>
+                    </w:tc>
+                  </w:tr>
+                </w:tbl>
+                <w:p/>
+              </w:tc>
+            </w:tr>
+          </w:tbl>
+          <w:p/>
+          <w:p>
+            <w:pPr>
+              <w:spacing w:before="240" w:after="60" w:line="269" w:lineRule="auto"/>
+              <w:jc w:val="left"/>
+              <w:pBdr>
+                <w:bottom w:val="single" w:sz="12" w:space="5" w:color="1A5A6E"/>
+              </w:pBdr>
+            </w:pPr>
+            <w:r>
+              <w:rPr>
+                <w:rFonts w:ascii="Calibri" w:hAnsi="Calibri" w:eastAsia="Calibri"/>
+                <w:b/>
+                <w:i w:val="0"/>
+                <w:color w:val="0F3D4C"/>
+                <w:sz w:val="26"/>
+              </w:rPr>
+              <w:t>PROFESSIONAL EXPERIENCE</w:t>
+            </w:r>
+          </w:p>
+          <w:tbl>
+            <w:tblPr>
+              <w:tblW w:type="auto" w:w="0"/>
+              <w:tblLook w:firstColumn="1" w:firstRow="1" w:lastColumn="0" w:lastRow="0" w:noHBand="0" w:noVBand="1" w:val="04A0"/>
+              <w:tblBorders>
+                <w:top w:val="nil" w:sz="0" w:space="0" w:color="auto"/>
+                <w:left w:val="nil" w:sz="0" w:space="0" w:color="auto"/>
+                <w:bottom w:val="nil" w:sz="0" w:space="0" w:color="auto"/>
+                <w:right w:val="nil" w:sz="0" w:space="0" w:color="auto"/>
+                <w:insideH w:val="nil" w:sz="0" w:space="0" w:color="auto"/>
+                <w:insideV w:val="nil" w:sz="0" w:space="0" w:color="auto"/>
+              </w:tblBorders>
+            </w:tblPr>
+            <w:tblGrid>
+              <w:gridCol w:w="6520"/>
+              <w:gridCol w:w="3118"/>
+            </w:tblGrid>
+            <w:tr>
+              <w:tc>
+                <w:tcPr>
+                  <w:tcW w:type="dxa" w:w="4513"/>
+                  <w:tcMar>
+                    <w:top w:w="40" w:type="dxa"/>
+                    <w:left w:w="0" w:type="dxa"/>
+                    <w:bottom w:w="0" w:type="dxa"/>
+                    <w:right w:w="40" w:type="dxa"/>
+                  </w:tcMar>
+                </w:tcPr>
+                <w:p>
+                  <w:pPr>
+                    <w:spacing w:before="0" w:after="0" w:line="252" w:lineRule="auto"/>
+                  </w:pPr>
+                  <w:r>
+                    <w:rPr>
+                      <w:rFonts w:ascii="Calibri" w:hAnsi="Calibri" w:eastAsia="Calibri"/>
+                      <w:b/>
+                      <w:i w:val="0"/>
+                      <w:color w:val="0F3D4C"/>
+                      <w:sz w:val="25"/>
+                    </w:rPr>
+                    <w:t>Valuation Surveyor</w:t>
+                  </w:r>
+                </w:p>
+              </w:tc>
+              <w:tc>
+                <w:tcPr>
+                  <w:tcW w:type="dxa" w:w="4513"/>
+                  <w:tcMar>
+                    <w:top w:w="40" w:type="dxa"/>
+                    <w:left w:w="0" w:type="dxa"/>
+                    <w:bottom w:w="0" w:type="dxa"/>
+                    <w:right w:w="0" w:type="dxa"/>
+                  </w:tcMar>
+                </w:tcPr>
+                <w:p>
+                  <w:pPr>
+                    <w:spacing w:before="0" w:after="0" w:line="252" w:lineRule="auto"/>
+                    <w:jc w:val="right"/>
+                  </w:pPr>
+                  <w:r>
+                    <w:rPr>
+                      <w:rFonts w:ascii="Calibri" w:hAnsi="Calibri" w:eastAsia="Calibri"/>
+                      <w:b w:val="0"/>
+                      <w:i w:val="0"/>
+                      <w:color w:val="1A5A6E"/>
+                      <w:sz w:val="21"/>
+                    </w:rPr>
+                    <w:t>Aug 2023 - Present</w:t>
+                  </w:r>
+                </w:p>
+              </w:tc>
+            </w:tr>
+          </w:tbl>
+          <w:p/>
+          <w:p>
+            <w:pPr>
+              <w:spacing w:before="0" w:after="40" w:line="269" w:lineRule="auto"/>
+              <w:jc w:val="left"/>
+            </w:pPr>
+            <w:r>
+              <w:rPr>
+                <w:rFonts w:ascii="Calibri" w:hAnsi="Calibri" w:eastAsia="Calibri"/>
+                <w:b w:val="0"/>
+                <w:i/>
+                <w:color w:val="1A5A6E"/>
+                <w:sz w:val="22"/>
+              </w:rPr>
+              <w:t>COVAE (U) Ltd</w:t>
+            </w:r>
+          </w:p>
+          <w:p>
+            <w:pPr>
+              <w:spacing w:before="0" w:after="20" w:line="269" w:lineRule="auto"/>
+              <w:ind w:left="198"/>
+              <w:jc w:val="left"/>
+            </w:pPr>
             <w:r>
               <w:rPr>
                 <w:rFonts w:ascii="Calibri" w:hAnsi="Calibri" w:eastAsia="Calibri"/>
                 <w:b w:val="0"/>
                 <w:i w:val="0"/>
-                <w:color w:val="4A5568"/>
-                <w:sz w:val="18"/>
+                <w:color w:val="5A6A75"/>
+                <w:sz w:val="22"/>
               </w:rPr>
-              <w:t>•  Extensive experience in Resettlement Action Plans (RAPs)</w:t>
+              <w:t>•  Lead valuation assignments for mortgage, compensation and acquisition purposes.</w:t>
             </w:r>
           </w:p>
-        </w:tc>
-        <w:tc>
-          <w:tcPr>
-            <w:tcW w:type="dxa" w:w="5046"/>
-            <w:tcMar>
-              <w:top w:w="20" w:type="dxa"/>
-              <w:left w:w="40" w:type="dxa"/>
-              <w:bottom w:w="20" w:type="dxa"/>
-              <w:right w:w="80" w:type="dxa"/>
-            </w:tcMar>
-          </w:tcPr>
           <w:p>
             <w:pPr>
-              <w:spacing w:before="0" w:after="20" w:line="252" w:lineRule="auto"/>
+              <w:spacing w:before="0" w:after="20" w:line="269" w:lineRule="auto"/>
+              <w:ind w:left="198"/>
+              <w:jc w:val="left"/>
             </w:pPr>
-            <w:r/>
             <w:r>
               <w:rPr>
                 <w:rFonts w:ascii="Calibri" w:hAnsi="Calibri" w:eastAsia="Calibri"/>
                 <w:b w:val="0"/>
                 <w:i w:val="0"/>
-                <w:color w:val="4A5568"/>
-                <w:sz w:val="18"/>
+                <w:color w:val="5A6A75"/>
+                <w:sz w:val="22"/>
               </w:rPr>
-              <w:t>•  Strong stakeholder engagement and community mobilisation skills</w:t>
+              <w:t>•  Prepare valuation methodologies and comprehensive valuation reports.</w:t>
             </w:r>
           </w:p>
-        </w:tc>
-      </w:tr>
-      <w:tr>
-        <w:tc>
-          <w:tcPr>
-            <w:tcW w:type="dxa" w:w="5046"/>
-            <w:tcMar>
-              <w:top w:w="20" w:type="dxa"/>
-              <w:left w:w="40" w:type="dxa"/>
-              <w:bottom w:w="20" w:type="dxa"/>
-              <w:right w:w="80" w:type="dxa"/>
-            </w:tcMar>
-          </w:tcPr>
           <w:p>
             <w:pPr>
-              <w:spacing w:before="0" w:after="20" w:line="252" w:lineRule="auto"/>
+              <w:spacing w:before="0" w:after="20" w:line="269" w:lineRule="auto"/>
+              <w:ind w:left="198"/>
+              <w:jc w:val="left"/>
             </w:pPr>
-            <w:r/>
             <w:r>
               <w:rPr>
                 <w:rFonts w:ascii="Calibri" w:hAnsi="Calibri" w:eastAsia="Calibri"/>
                 <w:b w:val="0"/>
                 <w:i w:val="0"/>
-                <w:color w:val="4A5568"/>
-                <w:sz w:val="18"/>
+                <w:color w:val="5A6A75"/>
+                <w:sz w:val="22"/>
               </w:rPr>
-              <w:t>•  Property valuation for mortgage, compensation and acquisition</w:t>
+              <w:t>•  Conduct market research and neighbourhood analysis.</w:t>
             </w:r>
           </w:p>
-        </w:tc>
-        <w:tc>
-          <w:tcPr>
-            <w:tcW w:type="dxa" w:w="5046"/>
-            <w:tcMar>
-              <w:top w:w="20" w:type="dxa"/>
-              <w:left w:w="40" w:type="dxa"/>
-              <w:bottom w:w="20" w:type="dxa"/>
-              <w:right w:w="80" w:type="dxa"/>
-            </w:tcMar>
-          </w:tcPr>
           <w:p>
             <w:pPr>
-              <w:spacing w:before="0" w:after="20" w:line="252" w:lineRule="auto"/>
+              <w:spacing w:before="0" w:after="20" w:line="269" w:lineRule="auto"/>
+              <w:ind w:left="198"/>
+              <w:jc w:val="left"/>
             </w:pPr>
-            <w:r/>
+            <w:r>
+              <w:rPr>
+                <w:rFonts w:ascii="Calibri" w:hAnsi="Calibri" w:eastAsia="Calibri"/>
+                <w:b w:val="0"/>
+                <w:i w:val="0"/>
+                <w:color w:val="5A6A75"/>
+                <w:sz w:val="22"/>
+              </w:rPr>
+              <w:t>•  Support Resettlement Action Plan implementation for public infrastructure projects.</w:t>
+            </w:r>
           </w:p>
-        </w:tc>
-      </w:tr>
-    </w:tbl>
-    <w:p>
-      <w:pPr>
-        <w:spacing w:before="240" w:after="80" w:line="240" w:lineRule="auto"/>
-        <w:pBdr>
-          <w:bottom w:val="single" w:sz="12" w:space="4" w:color="2C5F6E"/>
-        </w:pBdr>
-      </w:pPr>
-      <w:r>
-        <w:rPr>
-          <w:rFonts w:ascii="Calibri" w:hAnsi="Calibri" w:eastAsia="Calibri"/>
-          <w:b/>
-          <w:i w:val="0"/>
-          <w:color w:val="1B3A4B"/>
-          <w:sz w:val="22"/>
-        </w:rPr>
-        <w:t>PROFESSIONAL EXPERIENCE</w:t>
-      </w:r>
-    </w:p>
-    <w:p>
-      <w:pPr>
-        <w:spacing w:before="120" w:after="0" w:line="252" w:lineRule="auto"/>
-      </w:pPr>
-      <w:r>
-        <w:rPr>
-          <w:rFonts w:ascii="Calibri" w:hAnsi="Calibri" w:eastAsia="Calibri"/>
-          <w:b/>
-          <w:i w:val="0"/>
-          <w:color w:val="1B3A4B"/>
-          <w:sz w:val="21"/>
-        </w:rPr>
-        <w:t>Valuation Surveyor</w:t>
-      </w:r>
-    </w:p>
-    <w:p>
-      <w:pPr>
-        <w:spacing w:before="0" w:after="40" w:line="240" w:lineRule="auto"/>
-      </w:pPr>
-      <w:r>
-        <w:rPr>
-          <w:rFonts w:ascii="Calibri" w:hAnsi="Calibri" w:eastAsia="Calibri"/>
-          <w:b w:val="0"/>
-          <w:i/>
-          <w:color w:val="2C5F6E"/>
-          <w:sz w:val="18"/>
-        </w:rPr>
-        <w:t>COVAE (U) Ltd  |  Aug 2023 - Present</w:t>
-      </w:r>
-    </w:p>
-    <w:p>
-      <w:pPr>
-        <w:pStyle w:val="ListBullet"/>
-        <w:spacing w:before="0" w:after="40" w:line="252" w:lineRule="auto"/>
-        <w:ind w:left="312"/>
-      </w:pPr>
-      <w:r>
-        <w:rPr>
-          <w:rFonts w:ascii="Calibri" w:hAnsi="Calibri" w:eastAsia="Calibri"/>
-          <w:b w:val="0"/>
-          <w:i w:val="0"/>
-          <w:color w:val="4A5568"/>
-          <w:sz w:val="19"/>
-        </w:rPr>
-        <w:t>Lead valuation assignments for mortgage, compensation and acquisition purposes.</w:t>
-      </w:r>
-    </w:p>
-    <w:p>
-      <w:pPr>
-        <w:pStyle w:val="ListBullet"/>
-        <w:spacing w:before="0" w:after="40" w:line="252" w:lineRule="auto"/>
-        <w:ind w:left="312"/>
-      </w:pPr>
-      <w:r>
-        <w:rPr>
-          <w:rFonts w:ascii="Calibri" w:hAnsi="Calibri" w:eastAsia="Calibri"/>
-          <w:b w:val="0"/>
-          <w:i w:val="0"/>
-          <w:color w:val="4A5568"/>
-          <w:sz w:val="19"/>
-        </w:rPr>
-        <w:t>Prepare valuation methodologies and comprehensive valuation reports.</w:t>
-      </w:r>
-    </w:p>
-    <w:p>
-      <w:pPr>
-        <w:pStyle w:val="ListBullet"/>
-        <w:spacing w:before="0" w:after="40" w:line="252" w:lineRule="auto"/>
-        <w:ind w:left="312"/>
-      </w:pPr>
-      <w:r>
-        <w:rPr>
-          <w:rFonts w:ascii="Calibri" w:hAnsi="Calibri" w:eastAsia="Calibri"/>
-          <w:b w:val="0"/>
-          <w:i w:val="0"/>
-          <w:color w:val="4A5568"/>
-          <w:sz w:val="19"/>
-        </w:rPr>
-        <w:t>Conduct market research and neighbourhood analysis.</w:t>
-      </w:r>
-    </w:p>
-    <w:p>
-      <w:pPr>
-        <w:pStyle w:val="ListBullet"/>
-        <w:spacing w:before="0" w:after="40" w:line="252" w:lineRule="auto"/>
-        <w:ind w:left="312"/>
-      </w:pPr>
-      <w:r>
-        <w:rPr>
-          <w:rFonts w:ascii="Calibri" w:hAnsi="Calibri" w:eastAsia="Calibri"/>
-          <w:b w:val="0"/>
-          <w:i w:val="0"/>
-          <w:color w:val="4A5568"/>
-          <w:sz w:val="19"/>
-        </w:rPr>
-        <w:t>Support Resettlement Action Plan implementation for public infrastructure projects.</w:t>
-      </w:r>
-    </w:p>
-    <w:p>
-      <w:pPr>
-        <w:spacing w:before="120" w:after="0" w:line="252" w:lineRule="auto"/>
-      </w:pPr>
-      <w:r>
-        <w:rPr>
-          <w:rFonts w:ascii="Calibri" w:hAnsi="Calibri" w:eastAsia="Calibri"/>
-          <w:b/>
-          <w:i w:val="0"/>
-          <w:color w:val="1B3A4B"/>
-          <w:sz w:val="21"/>
-        </w:rPr>
-        <w:t>Valuer</w:t>
-      </w:r>
-    </w:p>
-    <w:p>
-      <w:pPr>
-        <w:spacing w:before="0" w:after="40" w:line="240" w:lineRule="auto"/>
-      </w:pPr>
-      <w:r>
-        <w:rPr>
-          <w:rFonts w:ascii="Calibri" w:hAnsi="Calibri" w:eastAsia="Calibri"/>
-          <w:b w:val="0"/>
-          <w:i/>
-          <w:color w:val="2C5F6E"/>
-          <w:sz w:val="18"/>
-        </w:rPr>
-        <w:t>GMT Consults Ltd  |  Sept 2021 - Jul 2023</w:t>
-      </w:r>
-    </w:p>
-    <w:p>
-      <w:pPr>
-        <w:pStyle w:val="ListBullet"/>
-        <w:spacing w:before="0" w:after="40" w:line="252" w:lineRule="auto"/>
-        <w:ind w:left="312"/>
-      </w:pPr>
-      <w:r>
-        <w:rPr>
-          <w:rFonts w:ascii="Calibri" w:hAnsi="Calibri" w:eastAsia="Calibri"/>
-          <w:b w:val="0"/>
-          <w:i w:val="0"/>
-          <w:color w:val="4A5568"/>
-          <w:sz w:val="19"/>
-        </w:rPr>
-        <w:t>Delivered RAP valuation assignments for road, water and electricity transmission projects.</w:t>
-      </w:r>
-    </w:p>
-    <w:p>
-      <w:pPr>
-        <w:pStyle w:val="ListBullet"/>
-        <w:spacing w:before="0" w:after="40" w:line="252" w:lineRule="auto"/>
-        <w:ind w:left="312"/>
-      </w:pPr>
-      <w:r>
-        <w:rPr>
-          <w:rFonts w:ascii="Calibri" w:hAnsi="Calibri" w:eastAsia="Calibri"/>
-          <w:b w:val="0"/>
-          <w:i w:val="0"/>
-          <w:color w:val="4A5568"/>
-          <w:sz w:val="19"/>
-        </w:rPr>
-        <w:t>Coordinated stakeholder consultations, community engagement and grievance management.</w:t>
-      </w:r>
-    </w:p>
-    <w:p>
-      <w:pPr>
-        <w:pStyle w:val="ListBullet"/>
-        <w:spacing w:before="0" w:after="40" w:line="252" w:lineRule="auto"/>
-        <w:ind w:left="312"/>
-      </w:pPr>
-      <w:r>
-        <w:rPr>
-          <w:rFonts w:ascii="Calibri" w:hAnsi="Calibri" w:eastAsia="Calibri"/>
-          <w:b w:val="0"/>
-          <w:i w:val="0"/>
-          <w:color w:val="4A5568"/>
-          <w:sz w:val="19"/>
-        </w:rPr>
-        <w:t>Managed valuation data collection, verification and reporting.</w:t>
-      </w:r>
-    </w:p>
-    <w:p>
-      <w:pPr>
-        <w:spacing w:before="120" w:after="0" w:line="252" w:lineRule="auto"/>
-      </w:pPr>
-      <w:r>
-        <w:rPr>
-          <w:rFonts w:ascii="Calibri" w:hAnsi="Calibri" w:eastAsia="Calibri"/>
-          <w:b/>
-          <w:i w:val="0"/>
-          <w:color w:val="1B3A4B"/>
-          <w:sz w:val="21"/>
-        </w:rPr>
-        <w:t>Valuer</w:t>
-      </w:r>
-    </w:p>
-    <w:p>
-      <w:pPr>
-        <w:spacing w:before="0" w:after="40" w:line="240" w:lineRule="auto"/>
-      </w:pPr>
-      <w:r>
-        <w:rPr>
-          <w:rFonts w:ascii="Calibri" w:hAnsi="Calibri" w:eastAsia="Calibri"/>
-          <w:b w:val="0"/>
-          <w:i/>
-          <w:color w:val="2C5F6E"/>
-          <w:sz w:val="18"/>
-        </w:rPr>
-        <w:t>Ministry of Energy &amp; Mineral Development  |  May 2022 - Jul 2022</w:t>
-      </w:r>
-    </w:p>
-    <w:p>
-      <w:pPr>
-        <w:pStyle w:val="ListBullet"/>
-        <w:spacing w:before="0" w:after="40" w:line="252" w:lineRule="auto"/>
-        <w:ind w:left="312"/>
-      </w:pPr>
-      <w:r>
-        <w:rPr>
-          <w:rFonts w:ascii="Calibri" w:hAnsi="Calibri" w:eastAsia="Calibri"/>
-          <w:b w:val="0"/>
-          <w:i w:val="0"/>
-          <w:color w:val="4A5568"/>
-          <w:sz w:val="19"/>
-        </w:rPr>
-        <w:t>Negotiated wayleaves for rural electrification projects.</w:t>
-      </w:r>
-    </w:p>
-    <w:p>
-      <w:pPr>
-        <w:pStyle w:val="ListBullet"/>
-        <w:spacing w:before="0" w:after="40" w:line="252" w:lineRule="auto"/>
-        <w:ind w:left="312"/>
-      </w:pPr>
-      <w:r>
-        <w:rPr>
-          <w:rFonts w:ascii="Calibri" w:hAnsi="Calibri" w:eastAsia="Calibri"/>
-          <w:b w:val="0"/>
-          <w:i w:val="0"/>
-          <w:color w:val="4A5568"/>
-          <w:sz w:val="19"/>
-        </w:rPr>
-        <w:t>Managed compensation assessments and stakeholder engagement.</w:t>
-      </w:r>
-    </w:p>
-    <w:p>
-      <w:pPr>
-        <w:pStyle w:val="ListBullet"/>
-        <w:spacing w:before="0" w:after="40" w:line="252" w:lineRule="auto"/>
-        <w:ind w:left="312"/>
-      </w:pPr>
-      <w:r>
-        <w:rPr>
-          <w:rFonts w:ascii="Calibri" w:hAnsi="Calibri" w:eastAsia="Calibri"/>
-          <w:b w:val="0"/>
-          <w:i w:val="0"/>
-          <w:color w:val="4A5568"/>
-          <w:sz w:val="19"/>
-        </w:rPr>
-        <w:t>Supported electricity transmission corridor development.</w:t>
-      </w:r>
-    </w:p>
-    <w:p>
-      <w:pPr>
-        <w:spacing w:before="120" w:after="0" w:line="252" w:lineRule="auto"/>
-      </w:pPr>
-      <w:r>
-        <w:rPr>
-          <w:rFonts w:ascii="Calibri" w:hAnsi="Calibri" w:eastAsia="Calibri"/>
-          <w:b/>
-          <w:i w:val="0"/>
-          <w:color w:val="1B3A4B"/>
-          <w:sz w:val="21"/>
-        </w:rPr>
-        <w:t>Wayleave Liaison Officer</w:t>
-      </w:r>
-    </w:p>
-    <w:p>
-      <w:pPr>
-        <w:spacing w:before="0" w:after="40" w:line="240" w:lineRule="auto"/>
-      </w:pPr>
-      <w:r>
-        <w:rPr>
-          <w:rFonts w:ascii="Calibri" w:hAnsi="Calibri" w:eastAsia="Calibri"/>
-          <w:b w:val="0"/>
-          <w:i/>
-          <w:color w:val="2C5F6E"/>
-          <w:sz w:val="18"/>
-        </w:rPr>
-        <w:t>INTEC-GOPA International Energy Consultants  |  May 2021 - Sept 2021</w:t>
-      </w:r>
-    </w:p>
-    <w:p>
-      <w:pPr>
-        <w:pStyle w:val="ListBullet"/>
-        <w:spacing w:before="0" w:after="40" w:line="252" w:lineRule="auto"/>
-        <w:ind w:left="312"/>
-      </w:pPr>
-      <w:r>
-        <w:rPr>
-          <w:rFonts w:ascii="Calibri" w:hAnsi="Calibri" w:eastAsia="Calibri"/>
-          <w:b w:val="0"/>
-          <w:i w:val="0"/>
-          <w:color w:val="4A5568"/>
-          <w:sz w:val="19"/>
-        </w:rPr>
-        <w:t>Coordinated landowner negotiations and compensation processes.</w:t>
-      </w:r>
-    </w:p>
-    <w:p>
-      <w:pPr>
-        <w:pStyle w:val="ListBullet"/>
-        <w:spacing w:before="0" w:after="40" w:line="252" w:lineRule="auto"/>
-        <w:ind w:left="312"/>
-      </w:pPr>
-      <w:r>
-        <w:rPr>
-          <w:rFonts w:ascii="Calibri" w:hAnsi="Calibri" w:eastAsia="Calibri"/>
-          <w:b w:val="0"/>
-          <w:i w:val="0"/>
-          <w:color w:val="4A5568"/>
-          <w:sz w:val="19"/>
-        </w:rPr>
-        <w:t>Facilitated access agreements and community liaison for power distribution projects.</w:t>
-      </w:r>
-    </w:p>
-    <w:p>
-      <w:pPr>
-        <w:spacing w:before="120" w:after="0" w:line="252" w:lineRule="auto"/>
-      </w:pPr>
-      <w:r>
-        <w:rPr>
-          <w:rFonts w:ascii="Calibri" w:hAnsi="Calibri" w:eastAsia="Calibri"/>
-          <w:b/>
-          <w:i w:val="0"/>
-          <w:color w:val="1B3A4B"/>
-          <w:sz w:val="21"/>
-        </w:rPr>
-        <w:t>Valuation Surveyor</w:t>
-      </w:r>
-    </w:p>
-    <w:p>
-      <w:pPr>
-        <w:spacing w:before="0" w:after="40" w:line="240" w:lineRule="auto"/>
-      </w:pPr>
-      <w:r>
-        <w:rPr>
-          <w:rFonts w:ascii="Calibri" w:hAnsi="Calibri" w:eastAsia="Calibri"/>
-          <w:b w:val="0"/>
-          <w:i/>
-          <w:color w:val="2C5F6E"/>
-          <w:sz w:val="18"/>
-        </w:rPr>
-        <w:t>COVAE (U) Ltd  |  May 2018 - Apr 2020</w:t>
-      </w:r>
-    </w:p>
-    <w:p>
-      <w:pPr>
-        <w:pStyle w:val="ListBullet"/>
-        <w:spacing w:before="0" w:after="40" w:line="252" w:lineRule="auto"/>
-        <w:ind w:left="312"/>
-      </w:pPr>
-      <w:r>
-        <w:rPr>
-          <w:rFonts w:ascii="Calibri" w:hAnsi="Calibri" w:eastAsia="Calibri"/>
-          <w:b w:val="0"/>
-          <w:i w:val="0"/>
-          <w:color w:val="4A5568"/>
-          <w:sz w:val="19"/>
-        </w:rPr>
-        <w:t>Conducted mortgage, compensation and property valuations.</w:t>
-      </w:r>
-    </w:p>
-    <w:p>
-      <w:pPr>
-        <w:pStyle w:val="ListBullet"/>
-        <w:spacing w:before="0" w:after="40" w:line="252" w:lineRule="auto"/>
-        <w:ind w:left="312"/>
-      </w:pPr>
-      <w:r>
-        <w:rPr>
-          <w:rFonts w:ascii="Calibri" w:hAnsi="Calibri" w:eastAsia="Calibri"/>
-          <w:b w:val="0"/>
-          <w:i w:val="0"/>
-          <w:color w:val="4A5568"/>
-          <w:sz w:val="19"/>
-        </w:rPr>
-        <w:t>Prepared valuation reports for commercial banks, private clients and government projects.</w:t>
-      </w:r>
-    </w:p>
-    <w:p>
-      <w:pPr>
-        <w:spacing w:before="120" w:after="40" w:line="240" w:lineRule="auto"/>
-      </w:pPr>
-      <w:r>
-        <w:rPr>
-          <w:rFonts w:ascii="Calibri" w:hAnsi="Calibri" w:eastAsia="Calibri"/>
-          <w:b/>
-          <w:i w:val="0"/>
-          <w:color w:val="1B3A4B"/>
-          <w:sz w:val="20"/>
-        </w:rPr>
-        <w:t>Earlier Experience</w:t>
-      </w:r>
-    </w:p>
-    <w:p>
-      <w:pPr>
-        <w:pStyle w:val="ListBullet"/>
-        <w:spacing w:before="0" w:after="40" w:line="252" w:lineRule="auto"/>
-        <w:ind w:left="312"/>
-      </w:pPr>
-      <w:r>
-        <w:rPr>
-          <w:rFonts w:ascii="Calibri" w:hAnsi="Calibri" w:eastAsia="Calibri"/>
-          <w:b w:val="0"/>
-          <w:i w:val="0"/>
-          <w:color w:val="4A5568"/>
-          <w:sz w:val="19"/>
-        </w:rPr>
-        <w:t>Intern Valuer - Kampala Capital City Authority</w:t>
-      </w:r>
-    </w:p>
-    <w:p>
-      <w:pPr>
-        <w:pStyle w:val="ListBullet"/>
-        <w:spacing w:before="0" w:after="40" w:line="252" w:lineRule="auto"/>
-        <w:ind w:left="312"/>
-      </w:pPr>
-      <w:r>
-        <w:rPr>
-          <w:rFonts w:ascii="Calibri" w:hAnsi="Calibri" w:eastAsia="Calibri"/>
-          <w:b w:val="0"/>
-          <w:i w:val="0"/>
-          <w:color w:val="4A5568"/>
-          <w:sz w:val="19"/>
-        </w:rPr>
-        <w:t>Intern Valuer - Peak Partners Property Valuers &amp; Surveyors</w:t>
-      </w:r>
-    </w:p>
-    <w:p>
-      <w:pPr>
-        <w:spacing w:before="240" w:after="80" w:line="240" w:lineRule="auto"/>
-        <w:pBdr>
-          <w:bottom w:val="single" w:sz="12" w:space="4" w:color="2C5F6E"/>
-        </w:pBdr>
-      </w:pPr>
-      <w:r>
-        <w:rPr>
-          <w:rFonts w:ascii="Calibri" w:hAnsi="Calibri" w:eastAsia="Calibri"/>
-          <w:b/>
-          <w:i w:val="0"/>
-          <w:color w:val="1B3A4B"/>
-          <w:sz w:val="22"/>
-        </w:rPr>
-        <w:t>EDUCATION &amp; PROFESSIONAL MEMBERSHIP</w:t>
-      </w:r>
-    </w:p>
-    <w:tbl>
-      <w:tblPr>
-        <w:tblW w:type="auto" w:w="0"/>
-        <w:tblLook w:firstColumn="1" w:firstRow="1" w:lastColumn="0" w:lastRow="0" w:noHBand="0" w:noVBand="1" w:val="04A0"/>
-      </w:tblPr>
-      <w:tblGrid>
-        <w:gridCol w:w="5046"/>
-        <w:gridCol w:w="5046"/>
-      </w:tblGrid>
-      <w:tr>
-        <w:tc>
-          <w:tcPr>
-            <w:tcW w:type="dxa" w:w="5046"/>
-          </w:tcPr>
+          <w:tbl>
+            <w:tblPr>
+              <w:tblW w:type="auto" w:w="0"/>
+              <w:tblLook w:firstColumn="1" w:firstRow="1" w:lastColumn="0" w:lastRow="0" w:noHBand="0" w:noVBand="1" w:val="04A0"/>
+              <w:tblBorders>
+                <w:top w:val="nil" w:sz="0" w:space="0" w:color="auto"/>
+                <w:left w:val="nil" w:sz="0" w:space="0" w:color="auto"/>
+                <w:bottom w:val="nil" w:sz="0" w:space="0" w:color="auto"/>
+                <w:right w:val="nil" w:sz="0" w:space="0" w:color="auto"/>
+                <w:insideH w:val="nil" w:sz="0" w:space="0" w:color="auto"/>
+                <w:insideV w:val="nil" w:sz="0" w:space="0" w:color="auto"/>
+              </w:tblBorders>
+            </w:tblPr>
+            <w:tblGrid>
+              <w:gridCol w:w="6520"/>
+              <w:gridCol w:w="3118"/>
+            </w:tblGrid>
+            <w:tr>
+              <w:tc>
+                <w:tcPr>
+                  <w:tcW w:type="dxa" w:w="4513"/>
+                  <w:tcMar>
+                    <w:top w:w="40" w:type="dxa"/>
+                    <w:left w:w="0" w:type="dxa"/>
+                    <w:bottom w:w="0" w:type="dxa"/>
+                    <w:right w:w="40" w:type="dxa"/>
+                  </w:tcMar>
+                </w:tcPr>
+                <w:p>
+                  <w:pPr>
+                    <w:spacing w:before="0" w:after="0" w:line="252" w:lineRule="auto"/>
+                  </w:pPr>
+                  <w:r>
+                    <w:rPr>
+                      <w:rFonts w:ascii="Calibri" w:hAnsi="Calibri" w:eastAsia="Calibri"/>
+                      <w:b/>
+                      <w:i w:val="0"/>
+                      <w:color w:val="0F3D4C"/>
+                      <w:sz w:val="25"/>
+                    </w:rPr>
+                    <w:t>Valuer</w:t>
+                  </w:r>
+                </w:p>
+              </w:tc>
+              <w:tc>
+                <w:tcPr>
+                  <w:tcW w:type="dxa" w:w="4513"/>
+                  <w:tcMar>
+                    <w:top w:w="40" w:type="dxa"/>
+                    <w:left w:w="0" w:type="dxa"/>
+                    <w:bottom w:w="0" w:type="dxa"/>
+                    <w:right w:w="0" w:type="dxa"/>
+                  </w:tcMar>
+                </w:tcPr>
+                <w:p>
+                  <w:pPr>
+                    <w:spacing w:before="0" w:after="0" w:line="252" w:lineRule="auto"/>
+                    <w:jc w:val="right"/>
+                  </w:pPr>
+                  <w:r>
+                    <w:rPr>
+                      <w:rFonts w:ascii="Calibri" w:hAnsi="Calibri" w:eastAsia="Calibri"/>
+                      <w:b w:val="0"/>
+                      <w:i w:val="0"/>
+                      <w:color w:val="1A5A6E"/>
+                      <w:sz w:val="21"/>
+                    </w:rPr>
+                    <w:t>Sept 2021 - Jul 2023</w:t>
+                  </w:r>
+                </w:p>
+              </w:tc>
+            </w:tr>
+          </w:tbl>
+          <w:p/>
           <w:p>
             <w:pPr>
-              <w:spacing w:before="40" w:after="0" w:line="252" w:lineRule="auto"/>
+              <w:spacing w:before="0" w:after="40" w:line="269" w:lineRule="auto"/>
+              <w:jc w:val="left"/>
             </w:pPr>
-            <w:r/>
+            <w:r>
+              <w:rPr>
+                <w:rFonts w:ascii="Calibri" w:hAnsi="Calibri" w:eastAsia="Calibri"/>
+                <w:b w:val="0"/>
+                <w:i/>
+                <w:color w:val="1A5A6E"/>
+                <w:sz w:val="22"/>
+              </w:rPr>
+              <w:t>GMT Consults Ltd</w:t>
+            </w:r>
+          </w:p>
+          <w:p>
+            <w:pPr>
+              <w:spacing w:before="0" w:after="20" w:line="269" w:lineRule="auto"/>
+              <w:ind w:left="198"/>
+              <w:jc w:val="left"/>
+            </w:pPr>
+            <w:r>
+              <w:rPr>
+                <w:rFonts w:ascii="Calibri" w:hAnsi="Calibri" w:eastAsia="Calibri"/>
+                <w:b w:val="0"/>
+                <w:i w:val="0"/>
+                <w:color w:val="5A6A75"/>
+                <w:sz w:val="22"/>
+              </w:rPr>
+              <w:t>•  Delivered RAP valuation assignments for road, water and electricity transmission projects.</w:t>
+            </w:r>
+          </w:p>
+          <w:p>
+            <w:pPr>
+              <w:spacing w:before="0" w:after="20" w:line="269" w:lineRule="auto"/>
+              <w:ind w:left="198"/>
+              <w:jc w:val="left"/>
+            </w:pPr>
+            <w:r>
+              <w:rPr>
+                <w:rFonts w:ascii="Calibri" w:hAnsi="Calibri" w:eastAsia="Calibri"/>
+                <w:b w:val="0"/>
+                <w:i w:val="0"/>
+                <w:color w:val="5A6A75"/>
+                <w:sz w:val="22"/>
+              </w:rPr>
+              <w:t>•  Coordinated stakeholder consultations, community engagement and grievance management.</w:t>
+            </w:r>
+          </w:p>
+          <w:p>
+            <w:pPr>
+              <w:spacing w:before="0" w:after="20" w:line="269" w:lineRule="auto"/>
+              <w:ind w:left="198"/>
+              <w:jc w:val="left"/>
+            </w:pPr>
+            <w:r>
+              <w:rPr>
+                <w:rFonts w:ascii="Calibri" w:hAnsi="Calibri" w:eastAsia="Calibri"/>
+                <w:b w:val="0"/>
+                <w:i w:val="0"/>
+                <w:color w:val="5A6A75"/>
+                <w:sz w:val="22"/>
+              </w:rPr>
+              <w:t>•  Managed valuation data collection, verification and reporting.</w:t>
+            </w:r>
+          </w:p>
+          <w:tbl>
+            <w:tblPr>
+              <w:tblW w:type="auto" w:w="0"/>
+              <w:tblLook w:firstColumn="1" w:firstRow="1" w:lastColumn="0" w:lastRow="0" w:noHBand="0" w:noVBand="1" w:val="04A0"/>
+              <w:tblBorders>
+                <w:top w:val="nil" w:sz="0" w:space="0" w:color="auto"/>
+                <w:left w:val="nil" w:sz="0" w:space="0" w:color="auto"/>
+                <w:bottom w:val="nil" w:sz="0" w:space="0" w:color="auto"/>
+                <w:right w:val="nil" w:sz="0" w:space="0" w:color="auto"/>
+                <w:insideH w:val="nil" w:sz="0" w:space="0" w:color="auto"/>
+                <w:insideV w:val="nil" w:sz="0" w:space="0" w:color="auto"/>
+              </w:tblBorders>
+            </w:tblPr>
+            <w:tblGrid>
+              <w:gridCol w:w="6520"/>
+              <w:gridCol w:w="3118"/>
+            </w:tblGrid>
+            <w:tr>
+              <w:tc>
+                <w:tcPr>
+                  <w:tcW w:type="dxa" w:w="4513"/>
+                  <w:tcMar>
+                    <w:top w:w="40" w:type="dxa"/>
+                    <w:left w:w="0" w:type="dxa"/>
+                    <w:bottom w:w="0" w:type="dxa"/>
+                    <w:right w:w="40" w:type="dxa"/>
+                  </w:tcMar>
+                </w:tcPr>
+                <w:p>
+                  <w:pPr>
+                    <w:spacing w:before="0" w:after="0" w:line="252" w:lineRule="auto"/>
+                  </w:pPr>
+                  <w:r>
+                    <w:rPr>
+                      <w:rFonts w:ascii="Calibri" w:hAnsi="Calibri" w:eastAsia="Calibri"/>
+                      <w:b/>
+                      <w:i w:val="0"/>
+                      <w:color w:val="0F3D4C"/>
+                      <w:sz w:val="25"/>
+                    </w:rPr>
+                    <w:t>Valuer</w:t>
+                  </w:r>
+                </w:p>
+              </w:tc>
+              <w:tc>
+                <w:tcPr>
+                  <w:tcW w:type="dxa" w:w="4513"/>
+                  <w:tcMar>
+                    <w:top w:w="40" w:type="dxa"/>
+                    <w:left w:w="0" w:type="dxa"/>
+                    <w:bottom w:w="0" w:type="dxa"/>
+                    <w:right w:w="0" w:type="dxa"/>
+                  </w:tcMar>
+                </w:tcPr>
+                <w:p>
+                  <w:pPr>
+                    <w:spacing w:before="0" w:after="0" w:line="252" w:lineRule="auto"/>
+                    <w:jc w:val="right"/>
+                  </w:pPr>
+                  <w:r>
+                    <w:rPr>
+                      <w:rFonts w:ascii="Calibri" w:hAnsi="Calibri" w:eastAsia="Calibri"/>
+                      <w:b w:val="0"/>
+                      <w:i w:val="0"/>
+                      <w:color w:val="1A5A6E"/>
+                      <w:sz w:val="21"/>
+                    </w:rPr>
+                    <w:t>May 2022 - Jul 2022</w:t>
+                  </w:r>
+                </w:p>
+              </w:tc>
+            </w:tr>
+          </w:tbl>
+          <w:p/>
+          <w:p>
+            <w:pPr>
+              <w:spacing w:before="0" w:after="40" w:line="269" w:lineRule="auto"/>
+              <w:jc w:val="left"/>
+            </w:pPr>
+            <w:r>
+              <w:rPr>
+                <w:rFonts w:ascii="Calibri" w:hAnsi="Calibri" w:eastAsia="Calibri"/>
+                <w:b w:val="0"/>
+                <w:i/>
+                <w:color w:val="1A5A6E"/>
+                <w:sz w:val="22"/>
+              </w:rPr>
+              <w:t>Ministry of Energy &amp; Mineral Development</w:t>
+            </w:r>
+          </w:p>
+          <w:p>
+            <w:pPr>
+              <w:spacing w:before="0" w:after="20" w:line="269" w:lineRule="auto"/>
+              <w:ind w:left="198"/>
+              <w:jc w:val="left"/>
+            </w:pPr>
+            <w:r>
+              <w:rPr>
+                <w:rFonts w:ascii="Calibri" w:hAnsi="Calibri" w:eastAsia="Calibri"/>
+                <w:b w:val="0"/>
+                <w:i w:val="0"/>
+                <w:color w:val="5A6A75"/>
+                <w:sz w:val="22"/>
+              </w:rPr>
+              <w:t>•  Negotiated wayleaves for rural electrification projects.</w:t>
+            </w:r>
+          </w:p>
+          <w:p>
+            <w:pPr>
+              <w:spacing w:before="0" w:after="20" w:line="269" w:lineRule="auto"/>
+              <w:ind w:left="198"/>
+              <w:jc w:val="left"/>
+            </w:pPr>
+            <w:r>
+              <w:rPr>
+                <w:rFonts w:ascii="Calibri" w:hAnsi="Calibri" w:eastAsia="Calibri"/>
+                <w:b w:val="0"/>
+                <w:i w:val="0"/>
+                <w:color w:val="5A6A75"/>
+                <w:sz w:val="22"/>
+              </w:rPr>
+              <w:t>•  Managed compensation assessments and stakeholder engagement.</w:t>
+            </w:r>
+          </w:p>
+          <w:p>
+            <w:pPr>
+              <w:spacing w:before="0" w:after="20" w:line="269" w:lineRule="auto"/>
+              <w:ind w:left="198"/>
+              <w:jc w:val="left"/>
+            </w:pPr>
+            <w:r>
+              <w:rPr>
+                <w:rFonts w:ascii="Calibri" w:hAnsi="Calibri" w:eastAsia="Calibri"/>
+                <w:b w:val="0"/>
+                <w:i w:val="0"/>
+                <w:color w:val="5A6A75"/>
+                <w:sz w:val="22"/>
+              </w:rPr>
+              <w:t>•  Supported electricity transmission corridor development.</w:t>
+            </w:r>
+          </w:p>
+          <w:tbl>
+            <w:tblPr>
+              <w:tblW w:type="auto" w:w="0"/>
+              <w:tblLook w:firstColumn="1" w:firstRow="1" w:lastColumn="0" w:lastRow="0" w:noHBand="0" w:noVBand="1" w:val="04A0"/>
+              <w:tblBorders>
+                <w:top w:val="nil" w:sz="0" w:space="0" w:color="auto"/>
+                <w:left w:val="nil" w:sz="0" w:space="0" w:color="auto"/>
+                <w:bottom w:val="nil" w:sz="0" w:space="0" w:color="auto"/>
+                <w:right w:val="nil" w:sz="0" w:space="0" w:color="auto"/>
+                <w:insideH w:val="nil" w:sz="0" w:space="0" w:color="auto"/>
+                <w:insideV w:val="nil" w:sz="0" w:space="0" w:color="auto"/>
+              </w:tblBorders>
+            </w:tblPr>
+            <w:tblGrid>
+              <w:gridCol w:w="6520"/>
+              <w:gridCol w:w="3118"/>
+            </w:tblGrid>
+            <w:tr>
+              <w:tc>
+                <w:tcPr>
+                  <w:tcW w:type="dxa" w:w="4513"/>
+                  <w:tcMar>
+                    <w:top w:w="40" w:type="dxa"/>
+                    <w:left w:w="0" w:type="dxa"/>
+                    <w:bottom w:w="0" w:type="dxa"/>
+                    <w:right w:w="40" w:type="dxa"/>
+                  </w:tcMar>
+                </w:tcPr>
+                <w:p>
+                  <w:pPr>
+                    <w:spacing w:before="0" w:after="0" w:line="252" w:lineRule="auto"/>
+                  </w:pPr>
+                  <w:r>
+                    <w:rPr>
+                      <w:rFonts w:ascii="Calibri" w:hAnsi="Calibri" w:eastAsia="Calibri"/>
+                      <w:b/>
+                      <w:i w:val="0"/>
+                      <w:color w:val="0F3D4C"/>
+                      <w:sz w:val="25"/>
+                    </w:rPr>
+                    <w:t>Wayleave Liaison Officer</w:t>
+                  </w:r>
+                </w:p>
+              </w:tc>
+              <w:tc>
+                <w:tcPr>
+                  <w:tcW w:type="dxa" w:w="4513"/>
+                  <w:tcMar>
+                    <w:top w:w="40" w:type="dxa"/>
+                    <w:left w:w="0" w:type="dxa"/>
+                    <w:bottom w:w="0" w:type="dxa"/>
+                    <w:right w:w="0" w:type="dxa"/>
+                  </w:tcMar>
+                </w:tcPr>
+                <w:p>
+                  <w:pPr>
+                    <w:spacing w:before="0" w:after="0" w:line="252" w:lineRule="auto"/>
+                    <w:jc w:val="right"/>
+                  </w:pPr>
+                  <w:r>
+                    <w:rPr>
+                      <w:rFonts w:ascii="Calibri" w:hAnsi="Calibri" w:eastAsia="Calibri"/>
+                      <w:b w:val="0"/>
+                      <w:i w:val="0"/>
+                      <w:color w:val="1A5A6E"/>
+                      <w:sz w:val="21"/>
+                    </w:rPr>
+                    <w:t>May 2021 - Sept 2021</w:t>
+                  </w:r>
+                </w:p>
+              </w:tc>
+            </w:tr>
+          </w:tbl>
+          <w:p/>
+          <w:p>
+            <w:pPr>
+              <w:spacing w:before="0" w:after="40" w:line="269" w:lineRule="auto"/>
+              <w:jc w:val="left"/>
+            </w:pPr>
+            <w:r>
+              <w:rPr>
+                <w:rFonts w:ascii="Calibri" w:hAnsi="Calibri" w:eastAsia="Calibri"/>
+                <w:b w:val="0"/>
+                <w:i/>
+                <w:color w:val="1A5A6E"/>
+                <w:sz w:val="22"/>
+              </w:rPr>
+              <w:t>INTEC-GOPA International Energy Consultants</w:t>
+            </w:r>
+          </w:p>
+          <w:p>
+            <w:pPr>
+              <w:spacing w:before="0" w:after="20" w:line="269" w:lineRule="auto"/>
+              <w:ind w:left="198"/>
+              <w:jc w:val="left"/>
+            </w:pPr>
+            <w:r>
+              <w:rPr>
+                <w:rFonts w:ascii="Calibri" w:hAnsi="Calibri" w:eastAsia="Calibri"/>
+                <w:b w:val="0"/>
+                <w:i w:val="0"/>
+                <w:color w:val="5A6A75"/>
+                <w:sz w:val="22"/>
+              </w:rPr>
+              <w:t>•  Coordinated landowner negotiations and compensation processes.</w:t>
+            </w:r>
+          </w:p>
+          <w:p>
+            <w:pPr>
+              <w:spacing w:before="0" w:after="20" w:line="269" w:lineRule="auto"/>
+              <w:ind w:left="198"/>
+              <w:jc w:val="left"/>
+            </w:pPr>
+            <w:r>
+              <w:rPr>
+                <w:rFonts w:ascii="Calibri" w:hAnsi="Calibri" w:eastAsia="Calibri"/>
+                <w:b w:val="0"/>
+                <w:i w:val="0"/>
+                <w:color w:val="5A6A75"/>
+                <w:sz w:val="22"/>
+              </w:rPr>
+              <w:t>•  Facilitated access agreements and community liaison for power distribution projects.</w:t>
+            </w:r>
+          </w:p>
+          <w:tbl>
+            <w:tblPr>
+              <w:tblW w:type="auto" w:w="0"/>
+              <w:tblLook w:firstColumn="1" w:firstRow="1" w:lastColumn="0" w:lastRow="0" w:noHBand="0" w:noVBand="1" w:val="04A0"/>
+              <w:tblBorders>
+                <w:top w:val="nil" w:sz="0" w:space="0" w:color="auto"/>
+                <w:left w:val="nil" w:sz="0" w:space="0" w:color="auto"/>
+                <w:bottom w:val="nil" w:sz="0" w:space="0" w:color="auto"/>
+                <w:right w:val="nil" w:sz="0" w:space="0" w:color="auto"/>
+                <w:insideH w:val="nil" w:sz="0" w:space="0" w:color="auto"/>
+                <w:insideV w:val="nil" w:sz="0" w:space="0" w:color="auto"/>
+              </w:tblBorders>
+            </w:tblPr>
+            <w:tblGrid>
+              <w:gridCol w:w="6520"/>
+              <w:gridCol w:w="3118"/>
+            </w:tblGrid>
+            <w:tr>
+              <w:tc>
+                <w:tcPr>
+                  <w:tcW w:type="dxa" w:w="4513"/>
+                  <w:tcMar>
+                    <w:top w:w="40" w:type="dxa"/>
+                    <w:left w:w="0" w:type="dxa"/>
+                    <w:bottom w:w="0" w:type="dxa"/>
+                    <w:right w:w="40" w:type="dxa"/>
+                  </w:tcMar>
+                </w:tcPr>
+                <w:p>
+                  <w:pPr>
+                    <w:spacing w:before="0" w:after="0" w:line="252" w:lineRule="auto"/>
+                  </w:pPr>
+                  <w:r>
+                    <w:rPr>
+                      <w:rFonts w:ascii="Calibri" w:hAnsi="Calibri" w:eastAsia="Calibri"/>
+                      <w:b/>
+                      <w:i w:val="0"/>
+                      <w:color w:val="0F3D4C"/>
+                      <w:sz w:val="25"/>
+                    </w:rPr>
+                    <w:t>Valuation Surveyor</w:t>
+                  </w:r>
+                </w:p>
+              </w:tc>
+              <w:tc>
+                <w:tcPr>
+                  <w:tcW w:type="dxa" w:w="4513"/>
+                  <w:tcMar>
+                    <w:top w:w="40" w:type="dxa"/>
+                    <w:left w:w="0" w:type="dxa"/>
+                    <w:bottom w:w="0" w:type="dxa"/>
+                    <w:right w:w="0" w:type="dxa"/>
+                  </w:tcMar>
+                </w:tcPr>
+                <w:p>
+                  <w:pPr>
+                    <w:spacing w:before="0" w:after="0" w:line="252" w:lineRule="auto"/>
+                    <w:jc w:val="right"/>
+                  </w:pPr>
+                  <w:r>
+                    <w:rPr>
+                      <w:rFonts w:ascii="Calibri" w:hAnsi="Calibri" w:eastAsia="Calibri"/>
+                      <w:b w:val="0"/>
+                      <w:i w:val="0"/>
+                      <w:color w:val="1A5A6E"/>
+                      <w:sz w:val="21"/>
+                    </w:rPr>
+                    <w:t>May 2018 - Apr 2020</w:t>
+                  </w:r>
+                </w:p>
+              </w:tc>
+            </w:tr>
+          </w:tbl>
+          <w:p/>
+          <w:p>
+            <w:pPr>
+              <w:spacing w:before="0" w:after="40" w:line="269" w:lineRule="auto"/>
+              <w:jc w:val="left"/>
+            </w:pPr>
+            <w:r>
+              <w:rPr>
+                <w:rFonts w:ascii="Calibri" w:hAnsi="Calibri" w:eastAsia="Calibri"/>
+                <w:b w:val="0"/>
+                <w:i/>
+                <w:color w:val="1A5A6E"/>
+                <w:sz w:val="22"/>
+              </w:rPr>
+              <w:t>COVAE (U) Ltd</w:t>
+            </w:r>
+          </w:p>
+          <w:p>
+            <w:pPr>
+              <w:spacing w:before="0" w:after="20" w:line="269" w:lineRule="auto"/>
+              <w:ind w:left="198"/>
+              <w:jc w:val="left"/>
+            </w:pPr>
+            <w:r>
+              <w:rPr>
+                <w:rFonts w:ascii="Calibri" w:hAnsi="Calibri" w:eastAsia="Calibri"/>
+                <w:b w:val="0"/>
+                <w:i w:val="0"/>
+                <w:color w:val="5A6A75"/>
+                <w:sz w:val="22"/>
+              </w:rPr>
+              <w:t>•  Conducted mortgage, compensation and property valuations.</w:t>
+            </w:r>
+          </w:p>
+          <w:p>
+            <w:pPr>
+              <w:spacing w:before="0" w:after="20" w:line="269" w:lineRule="auto"/>
+              <w:ind w:left="198"/>
+              <w:jc w:val="left"/>
+            </w:pPr>
+            <w:r>
+              <w:rPr>
+                <w:rFonts w:ascii="Calibri" w:hAnsi="Calibri" w:eastAsia="Calibri"/>
+                <w:b w:val="0"/>
+                <w:i w:val="0"/>
+                <w:color w:val="5A6A75"/>
+                <w:sz w:val="22"/>
+              </w:rPr>
+              <w:t>•  Prepared valuation reports for commercial banks, private clients and government projects.</w:t>
+            </w:r>
+          </w:p>
+          <w:p>
+            <w:pPr>
+              <w:spacing w:before="160" w:after="40" w:line="269" w:lineRule="auto"/>
+              <w:jc w:val="left"/>
+            </w:pPr>
             <w:r>
               <w:rPr>
                 <w:rFonts w:ascii="Calibri" w:hAnsi="Calibri" w:eastAsia="Calibri"/>
                 <w:b/>
                 <w:i w:val="0"/>
-                <w:color w:val="1B3A4B"/>
-                <w:sz w:val="20"/>
+                <w:color w:val="0F3D4C"/>
+                <w:sz w:val="23"/>
               </w:rPr>
-              <w:t>Bachelor of Science (Hons) in Land Economics</w:t>
+              <w:t>Earlier Experience</w:t>
             </w:r>
           </w:p>
-        </w:tc>
-        <w:tc>
-          <w:tcPr>
-            <w:tcW w:type="dxa" w:w="5046"/>
-          </w:tcPr>
           <w:p>
             <w:pPr>
-              <w:spacing w:before="40" w:after="0" w:line="252" w:lineRule="auto"/>
+              <w:spacing w:before="0" w:after="20" w:line="269" w:lineRule="auto"/>
+              <w:ind w:left="198"/>
+              <w:jc w:val="left"/>
             </w:pPr>
-            <w:r/>
+            <w:r>
+              <w:rPr>
+                <w:rFonts w:ascii="Calibri" w:hAnsi="Calibri" w:eastAsia="Calibri"/>
+                <w:b w:val="0"/>
+                <w:i w:val="0"/>
+                <w:color w:val="5A6A75"/>
+                <w:sz w:val="22"/>
+              </w:rPr>
+              <w:t>•  Intern Valuer - Kampala Capital City Authority</w:t>
+            </w:r>
+          </w:p>
+          <w:p>
+            <w:pPr>
+              <w:spacing w:before="0" w:after="20" w:line="269" w:lineRule="auto"/>
+              <w:ind w:left="198"/>
+              <w:jc w:val="left"/>
+            </w:pPr>
+            <w:r>
+              <w:rPr>
+                <w:rFonts w:ascii="Calibri" w:hAnsi="Calibri" w:eastAsia="Calibri"/>
+                <w:b w:val="0"/>
+                <w:i w:val="0"/>
+                <w:color w:val="5A6A75"/>
+                <w:sz w:val="22"/>
+              </w:rPr>
+              <w:t>•  Intern Valuer - Peak Partners Property Valuers &amp; Surveyors</w:t>
+            </w:r>
+          </w:p>
+          <w:p>
+            <w:pPr>
+              <w:spacing w:before="240" w:after="60" w:line="269" w:lineRule="auto"/>
+              <w:jc w:val="left"/>
+              <w:pBdr>
+                <w:bottom w:val="single" w:sz="12" w:space="5" w:color="1A5A6E"/>
+              </w:pBdr>
+            </w:pPr>
             <w:r>
               <w:rPr>
                 <w:rFonts w:ascii="Calibri" w:hAnsi="Calibri" w:eastAsia="Calibri"/>
                 <w:b/>
                 <w:i w:val="0"/>
-                <w:color w:val="1B3A4B"/>
-                <w:sz w:val="20"/>
+                <w:color w:val="0F3D4C"/>
+                <w:sz w:val="26"/>
               </w:rPr>
-              <w:t>Graduate Member</w:t>
+              <w:t>EDUCATION &amp; MEMBERSHIP</w:t>
             </w:r>
           </w:p>
-        </w:tc>
-      </w:tr>
-      <w:tr>
-        <w:tc>
-          <w:tcPr>
-            <w:tcW w:type="dxa" w:w="5046"/>
-          </w:tcPr>
+          <w:tbl>
+            <w:tblPr>
+              <w:tblW w:type="auto" w:w="0"/>
+              <w:tblLook w:firstColumn="1" w:firstRow="1" w:lastColumn="0" w:lastRow="0" w:noHBand="0" w:noVBand="1" w:val="04A0"/>
+              <w:tblBorders>
+                <w:top w:val="nil" w:sz="0" w:space="0" w:color="auto"/>
+                <w:left w:val="nil" w:sz="0" w:space="0" w:color="auto"/>
+                <w:bottom w:val="nil" w:sz="0" w:space="0" w:color="auto"/>
+                <w:right w:val="nil" w:sz="0" w:space="0" w:color="auto"/>
+                <w:insideH w:val="nil" w:sz="0" w:space="0" w:color="auto"/>
+                <w:insideV w:val="nil" w:sz="0" w:space="0" w:color="auto"/>
+              </w:tblBorders>
+            </w:tblPr>
+            <w:tblGrid>
+              <w:gridCol w:w="4513"/>
+              <w:gridCol w:w="4513"/>
+            </w:tblGrid>
+            <w:tr>
+              <w:tc>
+                <w:tcPr>
+                  <w:tcW w:type="dxa" w:w="4513"/>
+                  <w:tcMar>
+                    <w:top w:w="20" w:type="dxa"/>
+                    <w:left w:w="0" w:type="dxa"/>
+                    <w:bottom w:w="20" w:type="dxa"/>
+                    <w:right w:w="80" w:type="dxa"/>
+                  </w:tcMar>
+                </w:tcPr>
+                <w:p>
+                  <w:pPr>
+                    <w:spacing w:before="0" w:after="0" w:line="264" w:lineRule="auto"/>
+                  </w:pPr>
+                  <w:r/>
+                  <w:r>
+                    <w:rPr>
+                      <w:rFonts w:ascii="Calibri" w:hAnsi="Calibri" w:eastAsia="Calibri"/>
+                      <w:b/>
+                      <w:i w:val="0"/>
+                      <w:color w:val="0F3D4C"/>
+                      <w:sz w:val="23"/>
+                    </w:rPr>
+                    <w:t>Bachelor of Science (Hons) in Land Economics</w:t>
+                  </w:r>
+                </w:p>
+              </w:tc>
+              <w:tc>
+                <w:tcPr>
+                  <w:tcW w:type="dxa" w:w="4513"/>
+                  <w:tcMar>
+                    <w:top w:w="20" w:type="dxa"/>
+                    <w:left w:w="0" w:type="dxa"/>
+                    <w:bottom w:w="20" w:type="dxa"/>
+                    <w:right w:w="80" w:type="dxa"/>
+                  </w:tcMar>
+                </w:tcPr>
+                <w:p>
+                  <w:pPr>
+                    <w:spacing w:before="0" w:after="0" w:line="264" w:lineRule="auto"/>
+                  </w:pPr>
+                  <w:r/>
+                  <w:r>
+                    <w:rPr>
+                      <w:rFonts w:ascii="Calibri" w:hAnsi="Calibri" w:eastAsia="Calibri"/>
+                      <w:b/>
+                      <w:i w:val="0"/>
+                      <w:color w:val="0F3D4C"/>
+                      <w:sz w:val="23"/>
+                    </w:rPr>
+                    <w:t>Graduate Member, ISU</w:t>
+                  </w:r>
+                </w:p>
+              </w:tc>
+            </w:tr>
+            <w:tr>
+              <w:tc>
+                <w:tcPr>
+                  <w:tcW w:type="dxa" w:w="4513"/>
+                  <w:tcMar>
+                    <w:top w:w="20" w:type="dxa"/>
+                    <w:left w:w="0" w:type="dxa"/>
+                    <w:bottom w:w="20" w:type="dxa"/>
+                    <w:right w:w="80" w:type="dxa"/>
+                  </w:tcMar>
+                </w:tcPr>
+                <w:p>
+                  <w:pPr>
+                    <w:spacing w:before="0" w:after="0" w:line="264" w:lineRule="auto"/>
+                  </w:pPr>
+                  <w:r/>
+                  <w:r>
+                    <w:rPr>
+                      <w:rFonts w:ascii="Calibri" w:hAnsi="Calibri" w:eastAsia="Calibri"/>
+                      <w:b w:val="0"/>
+                      <w:i/>
+                      <w:color w:val="1A5A6E"/>
+                      <w:sz w:val="22"/>
+                    </w:rPr>
+                    <w:t>Makerere University</w:t>
+                  </w:r>
+                </w:p>
+              </w:tc>
+              <w:tc>
+                <w:tcPr>
+                  <w:tcW w:type="dxa" w:w="4513"/>
+                  <w:tcMar>
+                    <w:top w:w="20" w:type="dxa"/>
+                    <w:left w:w="0" w:type="dxa"/>
+                    <w:bottom w:w="20" w:type="dxa"/>
+                    <w:right w:w="80" w:type="dxa"/>
+                  </w:tcMar>
+                </w:tcPr>
+                <w:p>
+                  <w:pPr>
+                    <w:spacing w:before="0" w:after="0" w:line="264" w:lineRule="auto"/>
+                  </w:pPr>
+                  <w:r/>
+                  <w:r>
+                    <w:rPr>
+                      <w:rFonts w:ascii="Calibri" w:hAnsi="Calibri" w:eastAsia="Calibri"/>
+                      <w:b w:val="0"/>
+                      <w:i/>
+                      <w:color w:val="1A5A6E"/>
+                      <w:sz w:val="22"/>
+                    </w:rPr>
+                    <w:t>Institute of Surveyors of Uganda</w:t>
+                  </w:r>
+                </w:p>
+              </w:tc>
+            </w:tr>
+          </w:tbl>
+          <w:p/>
           <w:p>
             <w:pPr>
-              <w:spacing w:before="0" w:after="40" w:line="240" w:lineRule="auto"/>
+              <w:spacing w:before="240" w:after="60" w:line="269" w:lineRule="auto"/>
+              <w:jc w:val="left"/>
+              <w:pBdr>
+                <w:bottom w:val="single" w:sz="12" w:space="5" w:color="1A5A6E"/>
+              </w:pBdr>
             </w:pPr>
-            <w:r/>
+            <w:r>
+              <w:rPr>
+                <w:rFonts w:ascii="Calibri" w:hAnsi="Calibri" w:eastAsia="Calibri"/>
+                <w:b/>
+                <w:i w:val="0"/>
+                <w:color w:val="0F3D4C"/>
+                <w:sz w:val="26"/>
+              </w:rPr>
+              <w:t>KEY PROJECTS</w:t>
+            </w:r>
+          </w:p>
+          <w:tbl>
+            <w:tblPr>
+              <w:tblW w:type="auto" w:w="0"/>
+              <w:tblLook w:firstColumn="1" w:firstRow="1" w:lastColumn="0" w:lastRow="0" w:noHBand="0" w:noVBand="1" w:val="04A0"/>
+              <w:tblBorders>
+                <w:top w:val="nil" w:sz="0" w:space="0" w:color="auto"/>
+                <w:left w:val="nil" w:sz="0" w:space="0" w:color="auto"/>
+                <w:bottom w:val="nil" w:sz="0" w:space="0" w:color="auto"/>
+                <w:right w:val="nil" w:sz="0" w:space="0" w:color="auto"/>
+                <w:insideH w:val="nil" w:sz="0" w:space="0" w:color="auto"/>
+                <w:insideV w:val="nil" w:sz="0" w:space="0" w:color="auto"/>
+              </w:tblBorders>
+            </w:tblPr>
+            <w:tblGrid>
+              <w:gridCol w:w="4513"/>
+              <w:gridCol w:w="4513"/>
+            </w:tblGrid>
+            <w:tr>
+              <w:tc>
+                <w:tcPr>
+                  <w:tcW w:type="dxa" w:w="4513"/>
+                  <w:tcMar>
+                    <w:top w:w="15" w:type="dxa"/>
+                    <w:left w:w="0" w:type="dxa"/>
+                    <w:bottom w:w="15" w:type="dxa"/>
+                    <w:right w:w="60" w:type="dxa"/>
+                  </w:tcMar>
+                </w:tcPr>
+                <w:p>
+                  <w:pPr>
+                    <w:spacing w:before="0" w:after="0" w:line="269" w:lineRule="auto"/>
+                  </w:pPr>
+                  <w:r/>
+                  <w:r>
+                    <w:rPr>
+                      <w:rFonts w:ascii="Calibri" w:hAnsi="Calibri" w:eastAsia="Calibri"/>
+                      <w:b w:val="0"/>
+                      <w:i w:val="0"/>
+                      <w:color w:val="5A6A75"/>
+                      <w:sz w:val="22"/>
+                    </w:rPr>
+                    <w:t>•  Bagkara Mining Land Acquisition Project</w:t>
+                  </w:r>
+                </w:p>
+              </w:tc>
+              <w:tc>
+                <w:tcPr>
+                  <w:tcW w:type="dxa" w:w="4513"/>
+                  <w:tcMar>
+                    <w:top w:w="15" w:type="dxa"/>
+                    <w:left w:w="0" w:type="dxa"/>
+                    <w:bottom w:w="15" w:type="dxa"/>
+                    <w:right w:w="60" w:type="dxa"/>
+                  </w:tcMar>
+                </w:tcPr>
+                <w:p>
+                  <w:pPr>
+                    <w:spacing w:before="0" w:after="0" w:line="269" w:lineRule="auto"/>
+                  </w:pPr>
+                  <w:r/>
+                  <w:r>
+                    <w:rPr>
+                      <w:rFonts w:ascii="Calibri" w:hAnsi="Calibri" w:eastAsia="Calibri"/>
+                      <w:b w:val="0"/>
+                      <w:i w:val="0"/>
+                      <w:color w:val="5A6A75"/>
+                      <w:sz w:val="22"/>
+                    </w:rPr>
+                    <w:t>•  Muhanga-Kisizi-Rwashamaire Road Project</w:t>
+                  </w:r>
+                </w:p>
+              </w:tc>
+            </w:tr>
+            <w:tr>
+              <w:tc>
+                <w:tcPr>
+                  <w:tcW w:type="dxa" w:w="4513"/>
+                  <w:tcMar>
+                    <w:top w:w="15" w:type="dxa"/>
+                    <w:left w:w="0" w:type="dxa"/>
+                    <w:bottom w:w="15" w:type="dxa"/>
+                    <w:right w:w="60" w:type="dxa"/>
+                  </w:tcMar>
+                </w:tcPr>
+                <w:p>
+                  <w:pPr>
+                    <w:spacing w:before="0" w:after="0" w:line="269" w:lineRule="auto"/>
+                  </w:pPr>
+                  <w:r/>
+                  <w:r>
+                    <w:rPr>
+                      <w:rFonts w:ascii="Calibri" w:hAnsi="Calibri" w:eastAsia="Calibri"/>
+                      <w:b w:val="0"/>
+                      <w:i w:val="0"/>
+                      <w:color w:val="5A6A75"/>
+                      <w:sz w:val="22"/>
+                    </w:rPr>
+                    <w:t>•  Buliisa Service Station Compensation Valuation</w:t>
+                  </w:r>
+                </w:p>
+              </w:tc>
+              <w:tc>
+                <w:tcPr>
+                  <w:tcW w:type="dxa" w:w="4513"/>
+                  <w:tcMar>
+                    <w:top w:w="15" w:type="dxa"/>
+                    <w:left w:w="0" w:type="dxa"/>
+                    <w:bottom w:w="15" w:type="dxa"/>
+                    <w:right w:w="60" w:type="dxa"/>
+                  </w:tcMar>
+                </w:tcPr>
+                <w:p>
+                  <w:pPr>
+                    <w:spacing w:before="0" w:after="0" w:line="269" w:lineRule="auto"/>
+                  </w:pPr>
+                  <w:r/>
+                  <w:r>
+                    <w:rPr>
+                      <w:rFonts w:ascii="Calibri" w:hAnsi="Calibri" w:eastAsia="Calibri"/>
+                      <w:b w:val="0"/>
+                      <w:i w:val="0"/>
+                      <w:color w:val="5A6A75"/>
+                      <w:sz w:val="22"/>
+                    </w:rPr>
+                    <w:t>•  Masaka-Mbarara 400KV Transmission Line</w:t>
+                  </w:r>
+                </w:p>
+              </w:tc>
+            </w:tr>
+            <w:tr>
+              <w:tc>
+                <w:tcPr>
+                  <w:tcW w:type="dxa" w:w="4513"/>
+                  <w:tcMar>
+                    <w:top w:w="15" w:type="dxa"/>
+                    <w:left w:w="0" w:type="dxa"/>
+                    <w:bottom w:w="15" w:type="dxa"/>
+                    <w:right w:w="60" w:type="dxa"/>
+                  </w:tcMar>
+                </w:tcPr>
+                <w:p>
+                  <w:pPr>
+                    <w:spacing w:before="0" w:after="0" w:line="269" w:lineRule="auto"/>
+                  </w:pPr>
+                  <w:r/>
+                  <w:r>
+                    <w:rPr>
+                      <w:rFonts w:ascii="Calibri" w:hAnsi="Calibri" w:eastAsia="Calibri"/>
+                      <w:b w:val="0"/>
+                      <w:i w:val="0"/>
+                      <w:color w:val="5A6A75"/>
+                      <w:sz w:val="22"/>
+                    </w:rPr>
+                    <w:t>•  Singo Military Training School Compensation Project</w:t>
+                  </w:r>
+                </w:p>
+              </w:tc>
+              <w:tc>
+                <w:tcPr>
+                  <w:tcW w:type="dxa" w:w="4513"/>
+                  <w:tcMar>
+                    <w:top w:w="15" w:type="dxa"/>
+                    <w:left w:w="0" w:type="dxa"/>
+                    <w:bottom w:w="15" w:type="dxa"/>
+                    <w:right w:w="60" w:type="dxa"/>
+                  </w:tcMar>
+                </w:tcPr>
+                <w:p>
+                  <w:pPr>
+                    <w:spacing w:before="0" w:after="0" w:line="269" w:lineRule="auto"/>
+                  </w:pPr>
+                  <w:r/>
+                  <w:r>
+                    <w:rPr>
+                      <w:rFonts w:ascii="Calibri" w:hAnsi="Calibri" w:eastAsia="Calibri"/>
+                      <w:b w:val="0"/>
+                      <w:i w:val="0"/>
+                      <w:color w:val="5A6A75"/>
+                      <w:sz w:val="22"/>
+                    </w:rPr>
+                    <w:t>•  Rural Electrification Projects across Uganda</w:t>
+                  </w:r>
+                </w:p>
+              </w:tc>
+            </w:tr>
+            <w:tr>
+              <w:tc>
+                <w:tcPr>
+                  <w:tcW w:type="dxa" w:w="4513"/>
+                  <w:tcMar>
+                    <w:top w:w="15" w:type="dxa"/>
+                    <w:left w:w="0" w:type="dxa"/>
+                    <w:bottom w:w="15" w:type="dxa"/>
+                    <w:right w:w="60" w:type="dxa"/>
+                  </w:tcMar>
+                </w:tcPr>
+                <w:p>
+                  <w:pPr>
+                    <w:spacing w:before="0" w:after="0" w:line="269" w:lineRule="auto"/>
+                  </w:pPr>
+                  <w:r/>
+                  <w:r>
+                    <w:rPr>
+                      <w:rFonts w:ascii="Calibri" w:hAnsi="Calibri" w:eastAsia="Calibri"/>
+                      <w:b w:val="0"/>
+                      <w:i w:val="0"/>
+                      <w:color w:val="5A6A75"/>
+                      <w:sz w:val="22"/>
+                    </w:rPr>
+                    <w:t>•  Small Hydro Power Dam Resettlement Projects</w:t>
+                  </w:r>
+                </w:p>
+              </w:tc>
+              <w:tc>
+                <w:tcPr>
+                  <w:tcW w:type="dxa" w:w="4513"/>
+                  <w:tcMar>
+                    <w:top w:w="15" w:type="dxa"/>
+                    <w:left w:w="0" w:type="dxa"/>
+                    <w:bottom w:w="15" w:type="dxa"/>
+                    <w:right w:w="60" w:type="dxa"/>
+                  </w:tcMar>
+                </w:tcPr>
+                <w:p>
+                  <w:pPr>
+                    <w:spacing w:before="0" w:after="0" w:line="269" w:lineRule="auto"/>
+                  </w:pPr>
+                  <w:r/>
+                  <w:r>
+                    <w:rPr>
+                      <w:rFonts w:ascii="Calibri" w:hAnsi="Calibri" w:eastAsia="Calibri"/>
+                      <w:b w:val="0"/>
+                      <w:i w:val="0"/>
+                      <w:color w:val="5A6A75"/>
+                      <w:sz w:val="22"/>
+                    </w:rPr>
+                    <w:t>•  Mortgage valuation assignments for major commercial banks</w:t>
+                  </w:r>
+                </w:p>
+              </w:tc>
+            </w:tr>
+            <w:tr>
+              <w:tc>
+                <w:tcPr>
+                  <w:tcW w:type="dxa" w:w="4513"/>
+                  <w:tcMar>
+                    <w:top w:w="15" w:type="dxa"/>
+                    <w:left w:w="0" w:type="dxa"/>
+                    <w:bottom w:w="15" w:type="dxa"/>
+                    <w:right w:w="60" w:type="dxa"/>
+                  </w:tcMar>
+                </w:tcPr>
+                <w:p>
+                  <w:pPr>
+                    <w:spacing w:before="0" w:after="0" w:line="269" w:lineRule="auto"/>
+                  </w:pPr>
+                  <w:r/>
+                  <w:r>
+                    <w:rPr>
+                      <w:rFonts w:ascii="Calibri" w:hAnsi="Calibri" w:eastAsia="Calibri"/>
+                      <w:b w:val="0"/>
+                      <w:i w:val="0"/>
+                      <w:color w:val="5A6A75"/>
+                      <w:sz w:val="22"/>
+                    </w:rPr>
+                    <w:t>•  Isingiro Water Works Project</w:t>
+                  </w:r>
+                </w:p>
+              </w:tc>
+              <w:tc>
+                <w:tcPr>
+                  <w:tcW w:type="dxa" w:w="4513"/>
+                  <w:tcMar>
+                    <w:top w:w="15" w:type="dxa"/>
+                    <w:left w:w="0" w:type="dxa"/>
+                    <w:bottom w:w="15" w:type="dxa"/>
+                    <w:right w:w="60" w:type="dxa"/>
+                  </w:tcMar>
+                </w:tcPr>
+                <w:p>
+                  <w:pPr>
+                    <w:spacing w:before="0" w:after="0" w:line="269" w:lineRule="auto"/>
+                  </w:pPr>
+                  <w:r/>
+                </w:p>
+              </w:tc>
+            </w:tr>
+          </w:tbl>
+          <w:p/>
+          <w:p>
+            <w:pPr>
+              <w:spacing w:before="240" w:after="60" w:line="269" w:lineRule="auto"/>
+              <w:jc w:val="left"/>
+              <w:pBdr>
+                <w:bottom w:val="single" w:sz="12" w:space="5" w:color="1A5A6E"/>
+              </w:pBdr>
+            </w:pPr>
+            <w:r>
+              <w:rPr>
+                <w:rFonts w:ascii="Calibri" w:hAnsi="Calibri" w:eastAsia="Calibri"/>
+                <w:b/>
+                <w:i w:val="0"/>
+                <w:color w:val="0F3D4C"/>
+                <w:sz w:val="26"/>
+              </w:rPr>
+              <w:t>TECHNICAL EXPERTISE</w:t>
+            </w:r>
+          </w:p>
+          <w:p>
+            <w:pPr>
+              <w:spacing w:before="40" w:after="80" w:line="269" w:lineRule="auto"/>
+              <w:jc w:val="both"/>
+            </w:pPr>
             <w:r>
               <w:rPr>
                 <w:rFonts w:ascii="Calibri" w:hAnsi="Calibri" w:eastAsia="Calibri"/>
                 <w:b w:val="0"/>
-                <w:i/>
-                <w:color w:val="2C5F6E"/>
-                <w:sz w:val="19"/>
+                <w:i w:val="0"/>
+                <w:color w:val="2D3748"/>
+                <w:sz w:val="22"/>
               </w:rPr>
-              <w:t>Makerere University</w:t>
+              <w:t>Property Valuation  ·  Resettlement Action Plans (RAP)  ·  Land Acquisition  ·  Compensation Assessment  ·  Property Management  ·  Mortgage Valuation  ·  Property Market Analysis  ·  Community Engagement  ·  Geographic Information Systems (GIS)  ·  AutoCAD  ·  ArchiCAD  ·  REDAH Informatics  ·  VEKTA  ·  Microsoft Office Suite</w:t>
             </w:r>
           </w:p>
-        </w:tc>
-        <w:tc>
-          <w:tcPr>
-            <w:tcW w:type="dxa" w:w="5046"/>
-          </w:tcPr>
           <w:p>
             <w:pPr>
-              <w:spacing w:before="0" w:after="40" w:line="240" w:lineRule="auto"/>
+              <w:spacing w:before="240" w:after="60" w:line="269" w:lineRule="auto"/>
+              <w:jc w:val="left"/>
+              <w:pBdr>
+                <w:bottom w:val="single" w:sz="12" w:space="5" w:color="1A5A6E"/>
+              </w:pBdr>
             </w:pPr>
-            <w:r/>
+            <w:r>
+              <w:rPr>
+                <w:rFonts w:ascii="Calibri" w:hAnsi="Calibri" w:eastAsia="Calibri"/>
+                <w:b/>
+                <w:i w:val="0"/>
+                <w:color w:val="0F3D4C"/>
+                <w:sz w:val="26"/>
+              </w:rPr>
+              <w:t>CORE COMPETENCIES</w:t>
+            </w:r>
+          </w:p>
+          <w:tbl>
+            <w:tblPr>
+              <w:tblW w:type="auto" w:w="0"/>
+              <w:tblLook w:firstColumn="1" w:firstRow="1" w:lastColumn="0" w:lastRow="0" w:noHBand="0" w:noVBand="1" w:val="04A0"/>
+              <w:tblBorders>
+                <w:top w:val="nil" w:sz="0" w:space="0" w:color="auto"/>
+                <w:left w:val="nil" w:sz="0" w:space="0" w:color="auto"/>
+                <w:bottom w:val="nil" w:sz="0" w:space="0" w:color="auto"/>
+                <w:right w:val="nil" w:sz="0" w:space="0" w:color="auto"/>
+                <w:insideH w:val="nil" w:sz="0" w:space="0" w:color="auto"/>
+                <w:insideV w:val="nil" w:sz="0" w:space="0" w:color="auto"/>
+              </w:tblBorders>
+            </w:tblPr>
+            <w:tblGrid>
+              <w:gridCol w:w="4513"/>
+              <w:gridCol w:w="4513"/>
+            </w:tblGrid>
+            <w:tr>
+              <w:tc>
+                <w:tcPr>
+                  <w:tcW w:type="dxa" w:w="4513"/>
+                  <w:tcMar>
+                    <w:top w:w="15" w:type="dxa"/>
+                    <w:left w:w="0" w:type="dxa"/>
+                    <w:bottom w:w="15" w:type="dxa"/>
+                    <w:right w:w="60" w:type="dxa"/>
+                  </w:tcMar>
+                </w:tcPr>
+                <w:p>
+                  <w:pPr>
+                    <w:spacing w:before="0" w:after="0" w:line="269" w:lineRule="auto"/>
+                  </w:pPr>
+                  <w:r/>
+                  <w:r>
+                    <w:rPr>
+                      <w:rFonts w:ascii="Calibri" w:hAnsi="Calibri" w:eastAsia="Calibri"/>
+                      <w:b w:val="0"/>
+                      <w:i w:val="0"/>
+                      <w:color w:val="5A6A75"/>
+                      <w:sz w:val="22"/>
+                    </w:rPr>
+                    <w:t>•  Property &amp; Asset Valuation</w:t>
+                  </w:r>
+                </w:p>
+              </w:tc>
+              <w:tc>
+                <w:tcPr>
+                  <w:tcW w:type="dxa" w:w="4513"/>
+                  <w:tcMar>
+                    <w:top w:w="15" w:type="dxa"/>
+                    <w:left w:w="0" w:type="dxa"/>
+                    <w:bottom w:w="15" w:type="dxa"/>
+                    <w:right w:w="60" w:type="dxa"/>
+                  </w:tcMar>
+                </w:tcPr>
+                <w:p>
+                  <w:pPr>
+                    <w:spacing w:before="0" w:after="0" w:line="269" w:lineRule="auto"/>
+                  </w:pPr>
+                  <w:r/>
+                  <w:r>
+                    <w:rPr>
+                      <w:rFonts w:ascii="Calibri" w:hAnsi="Calibri" w:eastAsia="Calibri"/>
+                      <w:b w:val="0"/>
+                      <w:i w:val="0"/>
+                      <w:color w:val="5A6A75"/>
+                      <w:sz w:val="22"/>
+                    </w:rPr>
+                    <w:t>•  Property Market Research</w:t>
+                  </w:r>
+                </w:p>
+              </w:tc>
+            </w:tr>
+            <w:tr>
+              <w:tc>
+                <w:tcPr>
+                  <w:tcW w:type="dxa" w:w="4513"/>
+                  <w:tcMar>
+                    <w:top w:w="15" w:type="dxa"/>
+                    <w:left w:w="0" w:type="dxa"/>
+                    <w:bottom w:w="15" w:type="dxa"/>
+                    <w:right w:w="60" w:type="dxa"/>
+                  </w:tcMar>
+                </w:tcPr>
+                <w:p>
+                  <w:pPr>
+                    <w:spacing w:before="0" w:after="0" w:line="269" w:lineRule="auto"/>
+                  </w:pPr>
+                  <w:r/>
+                  <w:r>
+                    <w:rPr>
+                      <w:rFonts w:ascii="Calibri" w:hAnsi="Calibri" w:eastAsia="Calibri"/>
+                      <w:b w:val="0"/>
+                      <w:i w:val="0"/>
+                      <w:color w:val="5A6A75"/>
+                      <w:sz w:val="22"/>
+                    </w:rPr>
+                    <w:t>•  Land Acquisition &amp; Compensation</w:t>
+                  </w:r>
+                </w:p>
+              </w:tc>
+              <w:tc>
+                <w:tcPr>
+                  <w:tcW w:type="dxa" w:w="4513"/>
+                  <w:tcMar>
+                    <w:top w:w="15" w:type="dxa"/>
+                    <w:left w:w="0" w:type="dxa"/>
+                    <w:bottom w:w="15" w:type="dxa"/>
+                    <w:right w:w="60" w:type="dxa"/>
+                  </w:tcMar>
+                </w:tcPr>
+                <w:p>
+                  <w:pPr>
+                    <w:spacing w:before="0" w:after="0" w:line="269" w:lineRule="auto"/>
+                  </w:pPr>
+                  <w:r/>
+                  <w:r>
+                    <w:rPr>
+                      <w:rFonts w:ascii="Calibri" w:hAnsi="Calibri" w:eastAsia="Calibri"/>
+                      <w:b w:val="0"/>
+                      <w:i w:val="0"/>
+                      <w:color w:val="5A6A75"/>
+                      <w:sz w:val="22"/>
+                    </w:rPr>
+                    <w:t>•  Negotiation &amp; Conflict Resolution</w:t>
+                  </w:r>
+                </w:p>
+              </w:tc>
+            </w:tr>
+            <w:tr>
+              <w:tc>
+                <w:tcPr>
+                  <w:tcW w:type="dxa" w:w="4513"/>
+                  <w:tcMar>
+                    <w:top w:w="15" w:type="dxa"/>
+                    <w:left w:w="0" w:type="dxa"/>
+                    <w:bottom w:w="15" w:type="dxa"/>
+                    <w:right w:w="60" w:type="dxa"/>
+                  </w:tcMar>
+                </w:tcPr>
+                <w:p>
+                  <w:pPr>
+                    <w:spacing w:before="0" w:after="0" w:line="269" w:lineRule="auto"/>
+                  </w:pPr>
+                  <w:r/>
+                  <w:r>
+                    <w:rPr>
+                      <w:rFonts w:ascii="Calibri" w:hAnsi="Calibri" w:eastAsia="Calibri"/>
+                      <w:b w:val="0"/>
+                      <w:i w:val="0"/>
+                      <w:color w:val="5A6A75"/>
+                      <w:sz w:val="22"/>
+                    </w:rPr>
+                    <w:t>•  Resettlement Action Planning (RAP)</w:t>
+                  </w:r>
+                </w:p>
+              </w:tc>
+              <w:tc>
+                <w:tcPr>
+                  <w:tcW w:type="dxa" w:w="4513"/>
+                  <w:tcMar>
+                    <w:top w:w="15" w:type="dxa"/>
+                    <w:left w:w="0" w:type="dxa"/>
+                    <w:bottom w:w="15" w:type="dxa"/>
+                    <w:right w:w="60" w:type="dxa"/>
+                  </w:tcMar>
+                </w:tcPr>
+                <w:p>
+                  <w:pPr>
+                    <w:spacing w:before="0" w:after="0" w:line="269" w:lineRule="auto"/>
+                  </w:pPr>
+                  <w:r/>
+                  <w:r>
+                    <w:rPr>
+                      <w:rFonts w:ascii="Calibri" w:hAnsi="Calibri" w:eastAsia="Calibri"/>
+                      <w:b w:val="0"/>
+                      <w:i w:val="0"/>
+                      <w:color w:val="5A6A75"/>
+                      <w:sz w:val="22"/>
+                    </w:rPr>
+                    <w:t>•  Valuation Reporting</w:t>
+                  </w:r>
+                </w:p>
+              </w:tc>
+            </w:tr>
+            <w:tr>
+              <w:tc>
+                <w:tcPr>
+                  <w:tcW w:type="dxa" w:w="4513"/>
+                  <w:tcMar>
+                    <w:top w:w="15" w:type="dxa"/>
+                    <w:left w:w="0" w:type="dxa"/>
+                    <w:bottom w:w="15" w:type="dxa"/>
+                    <w:right w:w="60" w:type="dxa"/>
+                  </w:tcMar>
+                </w:tcPr>
+                <w:p>
+                  <w:pPr>
+                    <w:spacing w:before="0" w:after="0" w:line="269" w:lineRule="auto"/>
+                  </w:pPr>
+                  <w:r/>
+                  <w:r>
+                    <w:rPr>
+                      <w:rFonts w:ascii="Calibri" w:hAnsi="Calibri" w:eastAsia="Calibri"/>
+                      <w:b w:val="0"/>
+                      <w:i w:val="0"/>
+                      <w:color w:val="5A6A75"/>
+                      <w:sz w:val="22"/>
+                    </w:rPr>
+                    <w:t>•  Stakeholder Engagement</w:t>
+                  </w:r>
+                </w:p>
+              </w:tc>
+              <w:tc>
+                <w:tcPr>
+                  <w:tcW w:type="dxa" w:w="4513"/>
+                  <w:tcMar>
+                    <w:top w:w="15" w:type="dxa"/>
+                    <w:left w:w="0" w:type="dxa"/>
+                    <w:bottom w:w="15" w:type="dxa"/>
+                    <w:right w:w="60" w:type="dxa"/>
+                  </w:tcMar>
+                </w:tcPr>
+                <w:p>
+                  <w:pPr>
+                    <w:spacing w:before="0" w:after="0" w:line="269" w:lineRule="auto"/>
+                  </w:pPr>
+                  <w:r/>
+                  <w:r>
+                    <w:rPr>
+                      <w:rFonts w:ascii="Calibri" w:hAnsi="Calibri" w:eastAsia="Calibri"/>
+                      <w:b w:val="0"/>
+                      <w:i w:val="0"/>
+                      <w:color w:val="5A6A75"/>
+                      <w:sz w:val="22"/>
+                    </w:rPr>
+                    <w:t>•  Project Coordination</w:t>
+                  </w:r>
+                </w:p>
+              </w:tc>
+            </w:tr>
+            <w:tr>
+              <w:tc>
+                <w:tcPr>
+                  <w:tcW w:type="dxa" w:w="4513"/>
+                  <w:tcMar>
+                    <w:top w:w="15" w:type="dxa"/>
+                    <w:left w:w="0" w:type="dxa"/>
+                    <w:bottom w:w="15" w:type="dxa"/>
+                    <w:right w:w="60" w:type="dxa"/>
+                  </w:tcMar>
+                </w:tcPr>
+                <w:p>
+                  <w:pPr>
+                    <w:spacing w:before="0" w:after="0" w:line="269" w:lineRule="auto"/>
+                  </w:pPr>
+                  <w:r/>
+                  <w:r>
+                    <w:rPr>
+                      <w:rFonts w:ascii="Calibri" w:hAnsi="Calibri" w:eastAsia="Calibri"/>
+                      <w:b w:val="0"/>
+                      <w:i w:val="0"/>
+                      <w:color w:val="5A6A75"/>
+                      <w:sz w:val="22"/>
+                    </w:rPr>
+                    <w:t>•  Community Mobilisation</w:t>
+                  </w:r>
+                </w:p>
+              </w:tc>
+              <w:tc>
+                <w:tcPr>
+                  <w:tcW w:type="dxa" w:w="4513"/>
+                  <w:tcMar>
+                    <w:top w:w="15" w:type="dxa"/>
+                    <w:left w:w="0" w:type="dxa"/>
+                    <w:bottom w:w="15" w:type="dxa"/>
+                    <w:right w:w="60" w:type="dxa"/>
+                  </w:tcMar>
+                </w:tcPr>
+                <w:p>
+                  <w:pPr>
+                    <w:spacing w:before="0" w:after="0" w:line="269" w:lineRule="auto"/>
+                  </w:pPr>
+                  <w:r/>
+                  <w:r>
+                    <w:rPr>
+                      <w:rFonts w:ascii="Calibri" w:hAnsi="Calibri" w:eastAsia="Calibri"/>
+                      <w:b w:val="0"/>
+                      <w:i w:val="0"/>
+                      <w:color w:val="5A6A75"/>
+                      <w:sz w:val="22"/>
+                    </w:rPr>
+                    <w:t>•  Data Collection &amp; Analysis</w:t>
+                  </w:r>
+                </w:p>
+              </w:tc>
+            </w:tr>
+          </w:tbl>
+          <w:p/>
+          <w:p>
+            <w:pPr>
+              <w:spacing w:before="240" w:after="60" w:line="269" w:lineRule="auto"/>
+              <w:jc w:val="left"/>
+              <w:pBdr>
+                <w:bottom w:val="single" w:sz="12" w:space="5" w:color="1A5A6E"/>
+              </w:pBdr>
+            </w:pPr>
+            <w:r>
+              <w:rPr>
+                <w:rFonts w:ascii="Calibri" w:hAnsi="Calibri" w:eastAsia="Calibri"/>
+                <w:b/>
+                <w:i w:val="0"/>
+                <w:color w:val="0F3D4C"/>
+                <w:sz w:val="26"/>
+              </w:rPr>
+              <w:t>LANGUAGES</w:t>
+            </w:r>
+          </w:p>
+          <w:p>
+            <w:pPr>
+              <w:spacing w:before="40" w:after="120" w:line="269" w:lineRule="auto"/>
+              <w:jc w:val="left"/>
+            </w:pPr>
+            <w:r>
+              <w:rPr>
+                <w:rFonts w:ascii="Calibri" w:hAnsi="Calibri" w:eastAsia="Calibri"/>
+                <w:b/>
+                <w:i w:val="0"/>
+                <w:color w:val="0F3D4C"/>
+                <w:sz w:val="23"/>
+              </w:rPr>
+              <w:t>English</w:t>
+            </w:r>
             <w:r>
               <w:rPr>
                 <w:rFonts w:ascii="Calibri" w:hAnsi="Calibri" w:eastAsia="Calibri"/>
                 <w:b w:val="0"/>
-                <w:i/>
-                <w:color w:val="2C5F6E"/>
-                <w:sz w:val="19"/>
+                <w:i w:val="0"/>
+                <w:color w:val="5A6A75"/>
+                <w:sz w:val="23"/>
               </w:rPr>
-              <w:t>Institute of Surveyors of Uganda (ISU)</w:t>
+              <w:t xml:space="preserve">  ·  Fluent</w:t>
+            </w:r>
+            <w:r>
+              <w:rPr>
+                <w:rFonts w:ascii="Calibri" w:hAnsi="Calibri" w:eastAsia="Calibri"/>
+                <w:b w:val="0"/>
+                <w:i w:val="0"/>
+                <w:sz w:val="23"/>
+              </w:rPr>
+              <w:t xml:space="preserve">          </w:t>
+            </w:r>
+            <w:r>
+              <w:rPr>
+                <w:rFonts w:ascii="Calibri" w:hAnsi="Calibri" w:eastAsia="Calibri"/>
+                <w:b/>
+                <w:i w:val="0"/>
+                <w:color w:val="0F3D4C"/>
+                <w:sz w:val="23"/>
+              </w:rPr>
+              <w:t>Luganda</w:t>
+            </w:r>
+            <w:r>
+              <w:rPr>
+                <w:rFonts w:ascii="Calibri" w:hAnsi="Calibri" w:eastAsia="Calibri"/>
+                <w:b w:val="0"/>
+                <w:i w:val="0"/>
+                <w:color w:val="5A6A75"/>
+                <w:sz w:val="23"/>
+              </w:rPr>
+              <w:t xml:space="preserve">  ·  Native</w:t>
             </w:r>
           </w:p>
         </w:tc>
       </w:tr>
     </w:tbl>
-    <w:p>
-      <w:pPr>
-        <w:spacing w:before="240" w:after="80" w:line="240" w:lineRule="auto"/>
-        <w:pBdr>
-          <w:bottom w:val="single" w:sz="12" w:space="4" w:color="2C5F6E"/>
-        </w:pBdr>
-      </w:pPr>
-      <w:r>
-        <w:rPr>
-          <w:rFonts w:ascii="Calibri" w:hAnsi="Calibri" w:eastAsia="Calibri"/>
-          <w:b/>
-          <w:i w:val="0"/>
-          <w:color w:val="1B3A4B"/>
-          <w:sz w:val="22"/>
-        </w:rPr>
-        <w:t>KEY PROJECTS</w:t>
-      </w:r>
-    </w:p>
-    <w:tbl>
-      <w:tblPr>
-        <w:tblW w:type="auto" w:w="0"/>
-        <w:tblLook w:firstColumn="1" w:firstRow="1" w:lastColumn="0" w:lastRow="0" w:noHBand="0" w:noVBand="1" w:val="04A0"/>
-      </w:tblPr>
-      <w:tblGrid>
-        <w:gridCol w:w="5046"/>
-        <w:gridCol w:w="5046"/>
-      </w:tblGrid>
-      <w:tr>
-        <w:tc>
-          <w:tcPr>
-            <w:tcW w:type="dxa" w:w="5046"/>
-          </w:tcPr>
-          <w:p>
-            <w:pPr>
-              <w:spacing w:before="0" w:after="20" w:line="252" w:lineRule="auto"/>
-            </w:pPr>
-            <w:r/>
-            <w:r>
-              <w:rPr>
-                <w:rFonts w:ascii="Calibri" w:hAnsi="Calibri" w:eastAsia="Calibri"/>
-                <w:b w:val="0"/>
-                <w:i w:val="0"/>
-                <w:color w:val="4A5568"/>
-                <w:sz w:val="18"/>
-              </w:rPr>
-              <w:t>•  Bagkara Mining Land Acquisition Project</w:t>
-            </w:r>
-          </w:p>
-        </w:tc>
-        <w:tc>
-          <w:tcPr>
-            <w:tcW w:type="dxa" w:w="5046"/>
-          </w:tcPr>
-          <w:p>
-            <w:pPr>
-              <w:spacing w:before="0" w:after="20" w:line="252" w:lineRule="auto"/>
-            </w:pPr>
-            <w:r/>
-            <w:r>
-              <w:rPr>
-                <w:rFonts w:ascii="Calibri" w:hAnsi="Calibri" w:eastAsia="Calibri"/>
-                <w:b w:val="0"/>
-                <w:i w:val="0"/>
-                <w:color w:val="4A5568"/>
-                <w:sz w:val="18"/>
-              </w:rPr>
-              <w:t>•  Muhanga-Kisizi-Rwashamaire Road Project</w:t>
-            </w:r>
-          </w:p>
-        </w:tc>
-      </w:tr>
-      <w:tr>
-        <w:tc>
-          <w:tcPr>
-            <w:tcW w:type="dxa" w:w="5046"/>
-          </w:tcPr>
-          <w:p>
-            <w:pPr>
-              <w:spacing w:before="0" w:after="20" w:line="252" w:lineRule="auto"/>
-            </w:pPr>
-            <w:r/>
-            <w:r>
-              <w:rPr>
-                <w:rFonts w:ascii="Calibri" w:hAnsi="Calibri" w:eastAsia="Calibri"/>
-                <w:b w:val="0"/>
-                <w:i w:val="0"/>
-                <w:color w:val="4A5568"/>
-                <w:sz w:val="18"/>
-              </w:rPr>
-              <w:t>•  Buliisa Service Station Compensation Valuation</w:t>
-            </w:r>
-          </w:p>
-        </w:tc>
-        <w:tc>
-          <w:tcPr>
-            <w:tcW w:type="dxa" w:w="5046"/>
-          </w:tcPr>
-          <w:p>
-            <w:pPr>
-              <w:spacing w:before="0" w:after="20" w:line="252" w:lineRule="auto"/>
-            </w:pPr>
-            <w:r/>
-            <w:r>
-              <w:rPr>
-                <w:rFonts w:ascii="Calibri" w:hAnsi="Calibri" w:eastAsia="Calibri"/>
-                <w:b w:val="0"/>
-                <w:i w:val="0"/>
-                <w:color w:val="4A5568"/>
-                <w:sz w:val="18"/>
-              </w:rPr>
-              <w:t>•  Masaka-Mbarara 400KV Transmission Line</w:t>
-            </w:r>
-          </w:p>
-        </w:tc>
-      </w:tr>
-      <w:tr>
-        <w:tc>
-          <w:tcPr>
-            <w:tcW w:type="dxa" w:w="5046"/>
-          </w:tcPr>
-          <w:p>
-            <w:pPr>
-              <w:spacing w:before="0" w:after="20" w:line="252" w:lineRule="auto"/>
-            </w:pPr>
-            <w:r/>
-            <w:r>
-              <w:rPr>
-                <w:rFonts w:ascii="Calibri" w:hAnsi="Calibri" w:eastAsia="Calibri"/>
-                <w:b w:val="0"/>
-                <w:i w:val="0"/>
-                <w:color w:val="4A5568"/>
-                <w:sz w:val="18"/>
-              </w:rPr>
-              <w:t>•  Singo Military Training School Compensation Project</w:t>
-            </w:r>
-          </w:p>
-        </w:tc>
-        <w:tc>
-          <w:tcPr>
-            <w:tcW w:type="dxa" w:w="5046"/>
-          </w:tcPr>
-          <w:p>
-            <w:pPr>
-              <w:spacing w:before="0" w:after="20" w:line="252" w:lineRule="auto"/>
-            </w:pPr>
-            <w:r/>
-            <w:r>
-              <w:rPr>
-                <w:rFonts w:ascii="Calibri" w:hAnsi="Calibri" w:eastAsia="Calibri"/>
-                <w:b w:val="0"/>
-                <w:i w:val="0"/>
-                <w:color w:val="4A5568"/>
-                <w:sz w:val="18"/>
-              </w:rPr>
-              <w:t>•  Rural Electrification Projects across Uganda</w:t>
-            </w:r>
-          </w:p>
-        </w:tc>
-      </w:tr>
-      <w:tr>
-        <w:tc>
-          <w:tcPr>
-            <w:tcW w:type="dxa" w:w="5046"/>
-          </w:tcPr>
-          <w:p>
-            <w:pPr>
-              <w:spacing w:before="0" w:after="20" w:line="252" w:lineRule="auto"/>
-            </w:pPr>
-            <w:r/>
-            <w:r>
-              <w:rPr>
-                <w:rFonts w:ascii="Calibri" w:hAnsi="Calibri" w:eastAsia="Calibri"/>
-                <w:b w:val="0"/>
-                <w:i w:val="0"/>
-                <w:color w:val="4A5568"/>
-                <w:sz w:val="18"/>
-              </w:rPr>
-              <w:t>•  Small Hydro Power Dam Resettlement Projects</w:t>
-            </w:r>
-          </w:p>
-        </w:tc>
-        <w:tc>
-          <w:tcPr>
-            <w:tcW w:type="dxa" w:w="5046"/>
-          </w:tcPr>
-          <w:p>
-            <w:pPr>
-              <w:spacing w:before="0" w:after="20" w:line="252" w:lineRule="auto"/>
-            </w:pPr>
-            <w:r/>
-            <w:r>
-              <w:rPr>
-                <w:rFonts w:ascii="Calibri" w:hAnsi="Calibri" w:eastAsia="Calibri"/>
-                <w:b w:val="0"/>
-                <w:i w:val="0"/>
-                <w:color w:val="4A5568"/>
-                <w:sz w:val="18"/>
-              </w:rPr>
-              <w:t>•  Mortgage valuation assignments for major commercial banks</w:t>
-            </w:r>
-          </w:p>
-        </w:tc>
-      </w:tr>
-      <w:tr>
-        <w:tc>
-          <w:tcPr>
-            <w:tcW w:type="dxa" w:w="5046"/>
-          </w:tcPr>
-          <w:p>
-            <w:pPr>
-              <w:spacing w:before="0" w:after="20" w:line="252" w:lineRule="auto"/>
-            </w:pPr>
-            <w:r/>
-            <w:r>
-              <w:rPr>
-                <w:rFonts w:ascii="Calibri" w:hAnsi="Calibri" w:eastAsia="Calibri"/>
-                <w:b w:val="0"/>
-                <w:i w:val="0"/>
-                <w:color w:val="4A5568"/>
-                <w:sz w:val="18"/>
-              </w:rPr>
-              <w:t>•  Isingiro Water Works Project</w:t>
-            </w:r>
-          </w:p>
-        </w:tc>
-        <w:tc>
-          <w:tcPr>
-            <w:tcW w:type="dxa" w:w="5046"/>
-          </w:tcPr>
-          <w:p>
-            <w:pPr>
-              <w:spacing w:before="0" w:after="20" w:line="252" w:lineRule="auto"/>
-            </w:pPr>
-            <w:r/>
-          </w:p>
-        </w:tc>
-      </w:tr>
-    </w:tbl>
-    <w:p>
-      <w:pPr>
-        <w:spacing w:before="240" w:after="80" w:line="240" w:lineRule="auto"/>
-        <w:pBdr>
-          <w:bottom w:val="single" w:sz="12" w:space="4" w:color="2C5F6E"/>
-        </w:pBdr>
-      </w:pPr>
-      <w:r>
-        <w:rPr>
-          <w:rFonts w:ascii="Calibri" w:hAnsi="Calibri" w:eastAsia="Calibri"/>
-          <w:b/>
-          <w:i w:val="0"/>
-          <w:color w:val="1B3A4B"/>
-          <w:sz w:val="22"/>
-        </w:rPr>
-        <w:t>TECHNICAL EXPERTISE</w:t>
-      </w:r>
-    </w:p>
-    <w:p>
-      <w:pPr>
-        <w:spacing w:before="40" w:after="80" w:line="276" w:lineRule="auto"/>
-        <w:jc w:val="both"/>
-      </w:pPr>
-      <w:r>
-        <w:rPr>
-          <w:rFonts w:ascii="Calibri" w:hAnsi="Calibri" w:eastAsia="Calibri"/>
-          <w:b w:val="0"/>
-          <w:i w:val="0"/>
-          <w:color w:val="4A5568"/>
-          <w:sz w:val="18"/>
-        </w:rPr>
-        <w:t>Property Valuation  ·  Resettlement Action Plans (RAP)  ·  Land Acquisition  ·  Compensation Assessment  ·  Property Management  ·  Mortgage Valuation  ·  Property Market Analysis  ·  Community Engagement  ·  Geographic Information Systems (GIS)  ·  AutoCAD  ·  ArchiCAD  ·  REDAH Informatics  ·  VEKTA  ·  Microsoft Office Suite</w:t>
-      </w:r>
-    </w:p>
-    <w:p>
-      <w:pPr>
-        <w:spacing w:before="240" w:after="80" w:line="240" w:lineRule="auto"/>
-        <w:pBdr>
-          <w:bottom w:val="single" w:sz="12" w:space="4" w:color="2C5F6E"/>
-        </w:pBdr>
-      </w:pPr>
-      <w:r>
-        <w:rPr>
-          <w:rFonts w:ascii="Calibri" w:hAnsi="Calibri" w:eastAsia="Calibri"/>
-          <w:b/>
-          <w:i w:val="0"/>
-          <w:color w:val="1B3A4B"/>
-          <w:sz w:val="22"/>
-        </w:rPr>
-        <w:t>CORE COMPETENCIES</w:t>
-      </w:r>
-    </w:p>
-    <w:tbl>
-      <w:tblPr>
-        <w:tblW w:type="auto" w:w="0"/>
-        <w:tblLook w:firstColumn="1" w:firstRow="1" w:lastColumn="0" w:lastRow="0" w:noHBand="0" w:noVBand="1" w:val="04A0"/>
-      </w:tblPr>
-      <w:tblGrid>
-        <w:gridCol w:w="5046"/>
-        <w:gridCol w:w="5046"/>
-      </w:tblGrid>
-      <w:tr>
-        <w:tc>
-          <w:tcPr>
-            <w:tcW w:type="dxa" w:w="5046"/>
-          </w:tcPr>
-          <w:p>
-            <w:pPr>
-              <w:spacing w:before="0" w:after="20" w:line="252" w:lineRule="auto"/>
-            </w:pPr>
-            <w:r/>
-            <w:r>
-              <w:rPr>
-                <w:rFonts w:ascii="Calibri" w:hAnsi="Calibri" w:eastAsia="Calibri"/>
-                <w:b w:val="0"/>
-                <w:i w:val="0"/>
-                <w:color w:val="4A5568"/>
-                <w:sz w:val="18"/>
-              </w:rPr>
-              <w:t>•  Property &amp; Asset Valuation</w:t>
-            </w:r>
-          </w:p>
-        </w:tc>
-        <w:tc>
-          <w:tcPr>
-            <w:tcW w:type="dxa" w:w="5046"/>
-          </w:tcPr>
-          <w:p>
-            <w:pPr>
-              <w:spacing w:before="0" w:after="20" w:line="252" w:lineRule="auto"/>
-            </w:pPr>
-            <w:r/>
-            <w:r>
-              <w:rPr>
-                <w:rFonts w:ascii="Calibri" w:hAnsi="Calibri" w:eastAsia="Calibri"/>
-                <w:b w:val="0"/>
-                <w:i w:val="0"/>
-                <w:color w:val="4A5568"/>
-                <w:sz w:val="18"/>
-              </w:rPr>
-              <w:t>•  Property Market Research</w:t>
-            </w:r>
-          </w:p>
-        </w:tc>
-      </w:tr>
-      <w:tr>
-        <w:tc>
-          <w:tcPr>
-            <w:tcW w:type="dxa" w:w="5046"/>
-          </w:tcPr>
-          <w:p>
-            <w:pPr>
-              <w:spacing w:before="0" w:after="20" w:line="252" w:lineRule="auto"/>
-            </w:pPr>
-            <w:r/>
-            <w:r>
-              <w:rPr>
-                <w:rFonts w:ascii="Calibri" w:hAnsi="Calibri" w:eastAsia="Calibri"/>
-                <w:b w:val="0"/>
-                <w:i w:val="0"/>
-                <w:color w:val="4A5568"/>
-                <w:sz w:val="18"/>
-              </w:rPr>
-              <w:t>•  Land Acquisition &amp; Compensation</w:t>
-            </w:r>
-          </w:p>
-        </w:tc>
-        <w:tc>
-          <w:tcPr>
-            <w:tcW w:type="dxa" w:w="5046"/>
-          </w:tcPr>
-          <w:p>
-            <w:pPr>
-              <w:spacing w:before="0" w:after="20" w:line="252" w:lineRule="auto"/>
-            </w:pPr>
-            <w:r/>
-            <w:r>
-              <w:rPr>
-                <w:rFonts w:ascii="Calibri" w:hAnsi="Calibri" w:eastAsia="Calibri"/>
-                <w:b w:val="0"/>
-                <w:i w:val="0"/>
-                <w:color w:val="4A5568"/>
-                <w:sz w:val="18"/>
-              </w:rPr>
-              <w:t>•  Negotiation &amp; Conflict Resolution</w:t>
-            </w:r>
-          </w:p>
-        </w:tc>
-      </w:tr>
-      <w:tr>
-        <w:tc>
-          <w:tcPr>
-            <w:tcW w:type="dxa" w:w="5046"/>
-          </w:tcPr>
-          <w:p>
-            <w:pPr>
-              <w:spacing w:before="0" w:after="20" w:line="252" w:lineRule="auto"/>
-            </w:pPr>
-            <w:r/>
-            <w:r>
-              <w:rPr>
-                <w:rFonts w:ascii="Calibri" w:hAnsi="Calibri" w:eastAsia="Calibri"/>
-                <w:b w:val="0"/>
-                <w:i w:val="0"/>
-                <w:color w:val="4A5568"/>
-                <w:sz w:val="18"/>
-              </w:rPr>
-              <w:t>•  Resettlement Action Planning (RAP)</w:t>
-            </w:r>
-          </w:p>
-        </w:tc>
-        <w:tc>
-          <w:tcPr>
-            <w:tcW w:type="dxa" w:w="5046"/>
-          </w:tcPr>
-          <w:p>
-            <w:pPr>
-              <w:spacing w:before="0" w:after="20" w:line="252" w:lineRule="auto"/>
-            </w:pPr>
-            <w:r/>
-            <w:r>
-              <w:rPr>
-                <w:rFonts w:ascii="Calibri" w:hAnsi="Calibri" w:eastAsia="Calibri"/>
-                <w:b w:val="0"/>
-                <w:i w:val="0"/>
-                <w:color w:val="4A5568"/>
-                <w:sz w:val="18"/>
-              </w:rPr>
-              <w:t>•  Valuation Reporting</w:t>
-            </w:r>
-          </w:p>
-        </w:tc>
-      </w:tr>
-      <w:tr>
-        <w:tc>
-          <w:tcPr>
-            <w:tcW w:type="dxa" w:w="5046"/>
-          </w:tcPr>
-          <w:p>
-            <w:pPr>
-              <w:spacing w:before="0" w:after="20" w:line="252" w:lineRule="auto"/>
-            </w:pPr>
-            <w:r/>
-            <w:r>
-              <w:rPr>
-                <w:rFonts w:ascii="Calibri" w:hAnsi="Calibri" w:eastAsia="Calibri"/>
-                <w:b w:val="0"/>
-                <w:i w:val="0"/>
-                <w:color w:val="4A5568"/>
-                <w:sz w:val="18"/>
-              </w:rPr>
-              <w:t>•  Stakeholder Engagement</w:t>
-            </w:r>
-          </w:p>
-        </w:tc>
-        <w:tc>
-          <w:tcPr>
-            <w:tcW w:type="dxa" w:w="5046"/>
-          </w:tcPr>
-          <w:p>
-            <w:pPr>
-              <w:spacing w:before="0" w:after="20" w:line="252" w:lineRule="auto"/>
-            </w:pPr>
-            <w:r/>
-            <w:r>
-              <w:rPr>
-                <w:rFonts w:ascii="Calibri" w:hAnsi="Calibri" w:eastAsia="Calibri"/>
-                <w:b w:val="0"/>
-                <w:i w:val="0"/>
-                <w:color w:val="4A5568"/>
-                <w:sz w:val="18"/>
-              </w:rPr>
-              <w:t>•  Project Coordination</w:t>
-            </w:r>
-          </w:p>
-        </w:tc>
-      </w:tr>
-      <w:tr>
-        <w:tc>
-          <w:tcPr>
-            <w:tcW w:type="dxa" w:w="5046"/>
-          </w:tcPr>
-          <w:p>
-            <w:pPr>
-              <w:spacing w:before="0" w:after="20" w:line="252" w:lineRule="auto"/>
-            </w:pPr>
-            <w:r/>
-            <w:r>
-              <w:rPr>
-                <w:rFonts w:ascii="Calibri" w:hAnsi="Calibri" w:eastAsia="Calibri"/>
-                <w:b w:val="0"/>
-                <w:i w:val="0"/>
-                <w:color w:val="4A5568"/>
-                <w:sz w:val="18"/>
-              </w:rPr>
-              <w:t>•  Community Mobilisation</w:t>
-            </w:r>
-          </w:p>
-        </w:tc>
-        <w:tc>
-          <w:tcPr>
-            <w:tcW w:type="dxa" w:w="5046"/>
-          </w:tcPr>
-          <w:p>
-            <w:pPr>
-              <w:spacing w:before="0" w:after="20" w:line="252" w:lineRule="auto"/>
-            </w:pPr>
-            <w:r/>
-            <w:r>
-              <w:rPr>
-                <w:rFonts w:ascii="Calibri" w:hAnsi="Calibri" w:eastAsia="Calibri"/>
-                <w:b w:val="0"/>
-                <w:i w:val="0"/>
-                <w:color w:val="4A5568"/>
-                <w:sz w:val="18"/>
-              </w:rPr>
-              <w:t>•  Data Collection &amp; Analysis</w:t>
-            </w:r>
-          </w:p>
-        </w:tc>
-      </w:tr>
-    </w:tbl>
-    <w:p>
-      <w:pPr>
-        <w:spacing w:before="240" w:after="80" w:line="240" w:lineRule="auto"/>
-        <w:pBdr>
-          <w:bottom w:val="single" w:sz="12" w:space="4" w:color="2C5F6E"/>
-        </w:pBdr>
-      </w:pPr>
-      <w:r>
-        <w:rPr>
-          <w:rFonts w:ascii="Calibri" w:hAnsi="Calibri" w:eastAsia="Calibri"/>
-          <w:b/>
-          <w:i w:val="0"/>
-          <w:color w:val="1B3A4B"/>
-          <w:sz w:val="22"/>
-        </w:rPr>
-        <w:t>LANGUAGES</w:t>
-      </w:r>
-    </w:p>
-    <w:p>
-      <w:pPr>
-        <w:spacing w:before="40" w:after="0" w:line="252" w:lineRule="auto"/>
-      </w:pPr>
-      <w:r>
-        <w:rPr>
-          <w:rFonts w:ascii="Calibri" w:hAnsi="Calibri" w:eastAsia="Calibri"/>
-          <w:b w:val="0"/>
-          <w:i w:val="0"/>
-          <w:color w:val="4A5568"/>
-          <w:sz w:val="19"/>
-        </w:rPr>
-        <w:t>English  ·  Fluent</w:t>
-      </w:r>
-      <w:r>
-        <w:rPr>
-          <w:rFonts w:ascii="Calibri" w:hAnsi="Calibri" w:eastAsia="Calibri"/>
-          <w:b w:val="0"/>
-          <w:i w:val="0"/>
-          <w:sz w:val="19"/>
-        </w:rPr>
-        <w:t xml:space="preserve">          </w:t>
-      </w:r>
-      <w:r>
-        <w:rPr>
-          <w:rFonts w:ascii="Calibri" w:hAnsi="Calibri" w:eastAsia="Calibri"/>
-          <w:b w:val="0"/>
-          <w:i w:val="0"/>
-          <w:color w:val="4A5568"/>
-          <w:sz w:val="19"/>
-        </w:rPr>
-        <w:t>Luganda  ·  Native</w:t>
-      </w:r>
-    </w:p>
     <w:sectPr>
       <w:pgSz w:w="11906" w:h="16838"/>
-      <w:pgMar w:top="794" w:right="907" w:bottom="794" w:left="907" w:header="720" w:footer="720" w:gutter="0"/>
+      <w:pgMar w:top="0" w:right="0" w:bottom="737" w:left="0" w:header="720" w:footer="720" w:gutter="0"/>
       <w:cols w:space="720"/>
       <w:docGrid w:linePitch="360"/>
     </w:sectPr>

</xml_diff>